<commit_message>
Actualizacion de Taller v2
</commit_message>
<xml_diff>
--- a/SI886-PLANTILLA-TALLER.docx
+++ b/SI886-PLANTILLA-TALLER.docx
@@ -1,6 +1,6 @@
 
 <file path=word/document.xml><?xml version="1.0" encoding="utf-8"?>
-<w:document xmlns:wpc="http://schemas.microsoft.com/office/word/2010/wordprocessingCanvas" xmlns:cx="http://schemas.microsoft.com/office/drawing/2014/chartex" xmlns:cx1="http://schemas.microsoft.com/office/drawing/2015/9/8/chartex" xmlns:cx2="http://schemas.microsoft.com/office/drawing/2015/10/21/chartex" xmlns:cx3="http://schemas.microsoft.com/office/drawing/2016/5/9/chartex" xmlns:cx4="http://schemas.microsoft.com/office/drawing/2016/5/10/chartex" xmlns:cx5="http://schemas.microsoft.com/office/drawing/2016/5/11/chartex" xmlns:cx6="http://schemas.microsoft.com/office/drawing/2016/5/12/chartex" xmlns:cx7="http://schemas.microsoft.com/office/drawing/2016/5/13/chartex" xmlns:cx8="http://schemas.microsoft.com/office/drawing/2016/5/14/chartex" xmlns:mc="http://schemas.openxmlformats.org/markup-compatibility/2006" xmlns:m="http://schemas.openxmlformats.org/officeDocument/2006/math" xmlns:aink="http://schemas.microsoft.com/office/drawing/2016/ink" xmlns:am3d="http://schemas.microsoft.com/office/drawing/2017/model3d" xmlns:oel="http://schemas.microsoft.com/office/2019/extlst" xmlns:r="http://schemas.openxmlformats.org/officeDocument/2006/relationships" xmlns:wp14="http://schemas.microsoft.com/office/word/2010/wordprocessingDrawing" xmlns:wp="http://schemas.openxmlformats.org/drawingml/2006/wordprocessingDrawing" xmlns:wpg="http://schemas.microsoft.com/office/word/2010/wordprocessingGroup" xmlns:wpi="http://schemas.microsoft.com/office/word/2010/wordprocessingInk" xmlns:wps="http://schemas.microsoft.com/office/word/2010/wordprocessingShape" xmlns:o="urn:schemas-microsoft-com:office:office" xmlns:v="urn:schemas-microsoft-com:vml" xmlns:w10="urn:schemas-microsoft-com:office:word" xmlns:w="http://schemas.openxmlformats.org/wordprocessingml/2006/main" xmlns:w14="http://schemas.microsoft.com/office/word/2010/wordml" xmlns:w15="http://schemas.microsoft.com/office/word/2012/wordml" xmlns:w16cex="http://schemas.microsoft.com/office/word/2018/wordml/cex" xmlns:w16cid="http://schemas.microsoft.com/office/word/2016/wordml/cid" xmlns:w16="http://schemas.microsoft.com/office/word/2018/wordml" xmlns:w16sdtdh="http://schemas.microsoft.com/office/word/2020/wordml/sdtdatahash" xmlns:w16sdtfl="http://schemas.microsoft.com/office/word/2024/wordml/sdtformatlock" xmlns:w16se="http://schemas.microsoft.com/office/word/2015/wordml/symex" xmlns:w16du="http://schemas.microsoft.com/office/word/2023/wordml/word16du" xmlns:wne="http://schemas.microsoft.com/office/word/2006/wordml" mc:Ignorable="w14 w15 w16se w16cid w16 w16cex w16sdtdh w16sdtfl w16du wp14">
+<w:document xmlns:wpc="http://schemas.microsoft.com/office/word/2010/wordprocessingCanvas" xmlns:cx="http://schemas.microsoft.com/office/drawing/2014/chartex" xmlns:cx1="http://schemas.microsoft.com/office/drawing/2015/9/8/chartex" xmlns:cx2="http://schemas.microsoft.com/office/drawing/2015/10/21/chartex" xmlns:cx3="http://schemas.microsoft.com/office/drawing/2016/5/9/chartex" xmlns:cx4="http://schemas.microsoft.com/office/drawing/2016/5/10/chartex" xmlns:cx5="http://schemas.microsoft.com/office/drawing/2016/5/11/chartex" xmlns:cx6="http://schemas.microsoft.com/office/drawing/2016/5/12/chartex" xmlns:cx7="http://schemas.microsoft.com/office/drawing/2016/5/13/chartex" xmlns:cx8="http://schemas.microsoft.com/office/drawing/2016/5/14/chartex" xmlns:mc="http://schemas.openxmlformats.org/markup-compatibility/2006" xmlns:aink="http://schemas.microsoft.com/office/drawing/2016/ink" xmlns:am3d="http://schemas.microsoft.com/office/drawing/2017/model3d" xmlns:o="urn:schemas-microsoft-com:office:office" xmlns:r="http://schemas.openxmlformats.org/officeDocument/2006/relationships" xmlns:m="http://schemas.openxmlformats.org/officeDocument/2006/math" xmlns:v="urn:schemas-microsoft-com:vml" xmlns:wp14="http://schemas.microsoft.com/office/word/2010/wordprocessingDrawing" xmlns:wp="http://schemas.openxmlformats.org/drawingml/2006/wordprocessingDrawing" xmlns:w10="urn:schemas-microsoft-com:office:word" xmlns:w="http://schemas.openxmlformats.org/wordprocessingml/2006/main" xmlns:w14="http://schemas.microsoft.com/office/word/2010/wordml" xmlns:w15="http://schemas.microsoft.com/office/word/2012/wordml" xmlns:w16cid="http://schemas.microsoft.com/office/word/2016/wordml/cid" xmlns:w16se="http://schemas.microsoft.com/office/word/2015/wordml/symex" xmlns:wpg="http://schemas.microsoft.com/office/word/2010/wordprocessingGroup" xmlns:wpi="http://schemas.microsoft.com/office/word/2010/wordprocessingInk" xmlns:wne="http://schemas.microsoft.com/office/word/2006/wordml" xmlns:wps="http://schemas.microsoft.com/office/word/2010/wordprocessingShape" mc:Ignorable="w14 w15 w16se w16cid wp14">
   <w:body>
     <w:p>
       <w:pPr>
@@ -209,7 +209,7 @@
           <w:sz w:val="24"/>
           <w:szCs w:val="24"/>
         </w:rPr>
-        <w:t>…………………………………………….</w:t>
+        <w:t>Análisis comparado del PEI y del Plan de Gobierno Digital de una entidad real</w:t>
       </w:r>
       <w:r>
         <w:rPr>
@@ -274,7 +274,7 @@
           <w:sz w:val="24"/>
           <w:szCs w:val="24"/>
         </w:rPr>
-        <w:t>………………………….</w:t>
+        <w:t>PLANEAMIENTO ESTRATÉGICO DE TI</w:t>
       </w:r>
       <w:r>
         <w:rPr>
@@ -321,14 +321,62 @@
         <w:rPr>
           <w:sz w:val="24"/>
           <w:szCs w:val="24"/>
-        </w:rPr>
-      </w:pPr>
+          <w:lang w:val="es-ES"/>
+        </w:rPr>
+      </w:pPr>
+      <w:proofErr w:type="spellStart"/>
       <w:r>
         <w:rPr>
           <w:sz w:val="24"/>
           <w:szCs w:val="24"/>
-        </w:rPr>
-        <w:t xml:space="preserve">APELLIDOS Y NOMBRES · CÓDIGO </w:t>
+          <w:lang w:val="es-ES"/>
+        </w:rPr>
+        <w:t>Perez</w:t>
+      </w:r>
+      <w:proofErr w:type="spellEnd"/>
+      <w:r>
+        <w:rPr>
+          <w:sz w:val="24"/>
+          <w:szCs w:val="24"/>
+          <w:lang w:val="es-ES"/>
+        </w:rPr>
+        <w:t xml:space="preserve"> Peralta, </w:t>
+      </w:r>
+      <w:proofErr w:type="spellStart"/>
+      <w:r>
+        <w:rPr>
+          <w:sz w:val="24"/>
+          <w:szCs w:val="24"/>
+          <w:lang w:val="es-ES"/>
+        </w:rPr>
+        <w:t>Fabrizio</w:t>
+      </w:r>
+      <w:proofErr w:type="spellEnd"/>
+      <w:r>
+        <w:rPr>
+          <w:sz w:val="24"/>
+          <w:szCs w:val="24"/>
+          <w:lang w:val="es-ES"/>
+        </w:rPr>
+        <w:t xml:space="preserve"> Salvador </w:t>
+      </w:r>
+      <w:proofErr w:type="spellStart"/>
+      <w:r>
+        <w:rPr>
+          <w:sz w:val="24"/>
+          <w:szCs w:val="24"/>
+          <w:lang w:val="es-ES"/>
+        </w:rPr>
+        <w:t>Elias</w:t>
+      </w:r>
+      <w:proofErr w:type="spellEnd"/>
+      <w:r>
+        <w:rPr>
+          <w:sz w:val="24"/>
+          <w:szCs w:val="24"/>
+          <w:lang w:val="es-ES"/>
+        </w:rPr>
+        <w:t xml:space="preserve"> - 2023077476</w:t>
       </w:r>
     </w:p>
     <w:p>
@@ -472,7 +520,7 @@
     </w:p>
     <w:p>
       <w:pPr>
-        <w:pStyle w:val="Heading1"/>
+        <w:pStyle w:val="Ttulo1"/>
       </w:pPr>
       <w:r>
         <w:lastRenderedPageBreak/>
@@ -482,7 +530,7 @@
     </w:p>
     <w:p>
       <w:pPr>
-        <w:pStyle w:val="TOC1"/>
+        <w:pStyle w:val="TDC1"/>
         <w:tabs>
           <w:tab w:val="right" w:leader="dot" w:pos="9344"/>
         </w:tabs>
@@ -502,7 +550,7 @@
       <w:hyperlink w:anchor="_Toc238735926" w:history="1">
         <w:r>
           <w:rPr>
-            <w:rStyle w:val="Hyperlink"/>
+            <w:rStyle w:val="Hipervnculo"/>
             <w:noProof/>
           </w:rPr>
           <w:t>Índice</w:t>
@@ -559,7 +607,7 @@
     </w:p>
     <w:p>
       <w:pPr>
-        <w:pStyle w:val="TOC1"/>
+        <w:pStyle w:val="TDC1"/>
         <w:tabs>
           <w:tab w:val="right" w:leader="dot" w:pos="9344"/>
         </w:tabs>
@@ -570,7 +618,7 @@
       <w:hyperlink w:anchor="_Toc238735927" w:history="1">
         <w:r>
           <w:rPr>
-            <w:rStyle w:val="Hyperlink"/>
+            <w:rStyle w:val="Hipervnculo"/>
             <w:noProof/>
           </w:rPr>
           <w:t>Cómo se usa esta plantilla</w:t>
@@ -627,7 +675,7 @@
     </w:p>
     <w:p>
       <w:pPr>
-        <w:pStyle w:val="TOC1"/>
+        <w:pStyle w:val="TDC1"/>
         <w:tabs>
           <w:tab w:val="right" w:leader="dot" w:pos="9344"/>
         </w:tabs>
@@ -638,7 +686,7 @@
       <w:hyperlink w:anchor="_Toc238735928" w:history="1">
         <w:r>
           <w:rPr>
-            <w:rStyle w:val="Hyperlink"/>
+            <w:rStyle w:val="Hipervnculo"/>
             <w:noProof/>
           </w:rPr>
           <w:t>1. Información sobre el evento práctico</w:t>
@@ -695,7 +743,7 @@
     </w:p>
     <w:p>
       <w:pPr>
-        <w:pStyle w:val="TOC2"/>
+        <w:pStyle w:val="TDC2"/>
         <w:tabs>
           <w:tab w:val="right" w:leader="dot" w:pos="9344"/>
         </w:tabs>
@@ -706,7 +754,7 @@
       <w:hyperlink w:anchor="_Toc238735929" w:history="1">
         <w:r>
           <w:rPr>
-            <w:rStyle w:val="Hyperlink"/>
+            <w:rStyle w:val="Hipervnculo"/>
             <w:noProof/>
           </w:rPr>
           <w:t>1.1 Título del evento práctico</w:t>
@@ -763,7 +811,7 @@
     </w:p>
     <w:p>
       <w:pPr>
-        <w:pStyle w:val="TOC2"/>
+        <w:pStyle w:val="TDC2"/>
         <w:tabs>
           <w:tab w:val="right" w:leader="dot" w:pos="9344"/>
         </w:tabs>
@@ -774,7 +822,7 @@
       <w:hyperlink w:anchor="_Toc238735930" w:history="1">
         <w:r>
           <w:rPr>
-            <w:rStyle w:val="Hyperlink"/>
+            <w:rStyle w:val="Hipervnculo"/>
             <w:noProof/>
           </w:rPr>
           <w:t>1.2 Objetivos</w:t>
@@ -831,7 +879,7 @@
     </w:p>
     <w:p>
       <w:pPr>
-        <w:pStyle w:val="TOC2"/>
+        <w:pStyle w:val="TDC2"/>
         <w:tabs>
           <w:tab w:val="right" w:leader="dot" w:pos="9344"/>
         </w:tabs>
@@ -842,7 +890,7 @@
       <w:hyperlink w:anchor="_Toc238735931" w:history="1">
         <w:r>
           <w:rPr>
-            <w:rStyle w:val="Hyperlink"/>
+            <w:rStyle w:val="Hipervnculo"/>
             <w:noProof/>
           </w:rPr>
           <w:t>1.3 Tiempo de duración</w:t>
@@ -899,7 +947,7 @@
     </w:p>
     <w:p>
       <w:pPr>
-        <w:pStyle w:val="TOC2"/>
+        <w:pStyle w:val="TDC2"/>
         <w:tabs>
           <w:tab w:val="right" w:leader="dot" w:pos="9344"/>
         </w:tabs>
@@ -910,7 +958,7 @@
       <w:hyperlink w:anchor="_Toc238735932" w:history="1">
         <w:r>
           <w:rPr>
-            <w:rStyle w:val="Hyperlink"/>
+            <w:rStyle w:val="Hipervnculo"/>
             <w:noProof/>
           </w:rPr>
           <w:t>1.4 Resultados de aprendizaje</w:t>
@@ -967,7 +1015,7 @@
     </w:p>
     <w:p>
       <w:pPr>
-        <w:pStyle w:val="TOC2"/>
+        <w:pStyle w:val="TDC2"/>
         <w:tabs>
           <w:tab w:val="right" w:leader="dot" w:pos="9344"/>
         </w:tabs>
@@ -978,7 +1026,7 @@
       <w:hyperlink w:anchor="_Toc238735933" w:history="1">
         <w:r>
           <w:rPr>
-            <w:rStyle w:val="Hyperlink"/>
+            <w:rStyle w:val="Hipervnculo"/>
             <w:noProof/>
           </w:rPr>
           <w:t>1.5 Recursos</w:t>
@@ -1035,7 +1083,7 @@
     </w:p>
     <w:p>
       <w:pPr>
-        <w:pStyle w:val="TOC2"/>
+        <w:pStyle w:val="TDC2"/>
         <w:tabs>
           <w:tab w:val="right" w:leader="dot" w:pos="9344"/>
         </w:tabs>
@@ -1046,7 +1094,7 @@
       <w:hyperlink w:anchor="_Toc238735934" w:history="1">
         <w:r>
           <w:rPr>
-            <w:rStyle w:val="Hyperlink"/>
+            <w:rStyle w:val="Hipervnculo"/>
             <w:noProof/>
           </w:rPr>
           <w:t>1.6 Seguridad</w:t>
@@ -1103,7 +1151,7 @@
     </w:p>
     <w:p>
       <w:pPr>
-        <w:pStyle w:val="TOC1"/>
+        <w:pStyle w:val="TDC1"/>
         <w:tabs>
           <w:tab w:val="right" w:leader="dot" w:pos="9344"/>
         </w:tabs>
@@ -1114,7 +1162,7 @@
       <w:hyperlink w:anchor="_Toc238735935" w:history="1">
         <w:r>
           <w:rPr>
-            <w:rStyle w:val="Hyperlink"/>
+            <w:rStyle w:val="Hipervnculo"/>
             <w:noProof/>
           </w:rPr>
           <w:t>2. Procedimiento o metodología</w:t>
@@ -1171,7 +1219,7 @@
     </w:p>
     <w:p>
       <w:pPr>
-        <w:pStyle w:val="TOC2"/>
+        <w:pStyle w:val="TDC2"/>
         <w:tabs>
           <w:tab w:val="right" w:leader="dot" w:pos="9344"/>
         </w:tabs>
@@ -1182,7 +1230,7 @@
       <w:hyperlink w:anchor="_Toc238735936" w:history="1">
         <w:r>
           <w:rPr>
-            <w:rStyle w:val="Hyperlink"/>
+            <w:rStyle w:val="Hipervnculo"/>
             <w:noProof/>
           </w:rPr>
           <w:t>Paso A</w:t>
@@ -1239,7 +1287,7 @@
     </w:p>
     <w:p>
       <w:pPr>
-        <w:pStyle w:val="TOC2"/>
+        <w:pStyle w:val="TDC2"/>
         <w:tabs>
           <w:tab w:val="right" w:leader="dot" w:pos="9344"/>
         </w:tabs>
@@ -1250,7 +1298,7 @@
       <w:hyperlink w:anchor="_Toc238735937" w:history="1">
         <w:r>
           <w:rPr>
-            <w:rStyle w:val="Hyperlink"/>
+            <w:rStyle w:val="Hipervnculo"/>
             <w:noProof/>
           </w:rPr>
           <w:t>Paso B</w:t>
@@ -1307,7 +1355,7 @@
     </w:p>
     <w:p>
       <w:pPr>
-        <w:pStyle w:val="TOC2"/>
+        <w:pStyle w:val="TDC2"/>
         <w:tabs>
           <w:tab w:val="right" w:leader="dot" w:pos="9344"/>
         </w:tabs>
@@ -1318,7 +1366,7 @@
       <w:hyperlink w:anchor="_Toc238735938" w:history="1">
         <w:r>
           <w:rPr>
-            <w:rStyle w:val="Hyperlink"/>
+            <w:rStyle w:val="Hipervnculo"/>
             <w:noProof/>
           </w:rPr>
           <w:t>Paso C</w:t>
@@ -1375,7 +1423,7 @@
     </w:p>
     <w:p>
       <w:pPr>
-        <w:pStyle w:val="TOC1"/>
+        <w:pStyle w:val="TDC1"/>
         <w:tabs>
           <w:tab w:val="right" w:leader="dot" w:pos="9344"/>
         </w:tabs>
@@ -1386,7 +1434,7 @@
       <w:hyperlink w:anchor="_Toc238735939" w:history="1">
         <w:r>
           <w:rPr>
-            <w:rStyle w:val="Hyperlink"/>
+            <w:rStyle w:val="Hipervnculo"/>
             <w:noProof/>
           </w:rPr>
           <w:t>3. Resultados</w:t>
@@ -1443,7 +1491,7 @@
     </w:p>
     <w:p>
       <w:pPr>
-        <w:pStyle w:val="TOC1"/>
+        <w:pStyle w:val="TDC1"/>
         <w:tabs>
           <w:tab w:val="right" w:leader="dot" w:pos="9344"/>
         </w:tabs>
@@ -1454,7 +1502,7 @@
       <w:hyperlink w:anchor="_Toc238735940" w:history="1">
         <w:r>
           <w:rPr>
-            <w:rStyle w:val="Hyperlink"/>
+            <w:rStyle w:val="Hipervnculo"/>
             <w:noProof/>
           </w:rPr>
           <w:t>4. Conclusiones</w:t>
@@ -1511,7 +1559,7 @@
     </w:p>
     <w:p>
       <w:pPr>
-        <w:pStyle w:val="TOC1"/>
+        <w:pStyle w:val="TDC1"/>
         <w:tabs>
           <w:tab w:val="right" w:leader="dot" w:pos="9344"/>
         </w:tabs>
@@ -1522,7 +1570,7 @@
       <w:hyperlink w:anchor="_Toc238735941" w:history="1">
         <w:r>
           <w:rPr>
-            <w:rStyle w:val="Hyperlink"/>
+            <w:rStyle w:val="Hipervnculo"/>
             <w:noProof/>
           </w:rPr>
           <w:t>5. Cuestionario</w:t>
@@ -1579,7 +1627,7 @@
     </w:p>
     <w:p>
       <w:pPr>
-        <w:pStyle w:val="TOC1"/>
+        <w:pStyle w:val="TDC1"/>
         <w:tabs>
           <w:tab w:val="right" w:leader="dot" w:pos="9344"/>
         </w:tabs>
@@ -1590,7 +1638,7 @@
       <w:hyperlink w:anchor="_Toc238735942" w:history="1">
         <w:r>
           <w:rPr>
-            <w:rStyle w:val="Hyperlink"/>
+            <w:rStyle w:val="Hipervnculo"/>
             <w:noProof/>
           </w:rPr>
           <w:t>6. Referencias bibliográficas</w:t>
@@ -1647,7 +1695,7 @@
     </w:p>
     <w:p>
       <w:pPr>
-        <w:pStyle w:val="TOC1"/>
+        <w:pStyle w:val="TDC1"/>
         <w:tabs>
           <w:tab w:val="right" w:leader="dot" w:pos="9344"/>
         </w:tabs>
@@ -1658,7 +1706,7 @@
       <w:hyperlink w:anchor="_Toc238735943" w:history="1">
         <w:r>
           <w:rPr>
-            <w:rStyle w:val="Hyperlink"/>
+            <w:rStyle w:val="Hipervnculo"/>
             <w:noProof/>
           </w:rPr>
           <w:t>7. Anexos</w:t>
@@ -1725,22 +1773,25 @@
     </w:p>
     <w:p>
       <w:pPr>
-        <w:pStyle w:val="Heading1"/>
-      </w:pPr>
-      <w:bookmarkStart w:id="1" w:name="cómo-se-usa-esta-plantilla"/>
-      <w:bookmarkStart w:id="2" w:name="_Toc238735927"/>
+        <w:pStyle w:val="Ttulo1"/>
+      </w:pPr>
+      <w:bookmarkStart w:id="1" w:name="_Toc238735927"/>
+      <w:bookmarkStart w:id="2" w:name="cómo-se-usa-esta-plantilla"/>
       <w:r>
         <w:lastRenderedPageBreak/>
         <w:t>Cómo se usa esta plantilla</w:t>
       </w:r>
-      <w:bookmarkEnd w:id="2"/>
+      <w:bookmarkEnd w:id="1"/>
     </w:p>
     <w:p>
       <w:pPr>
         <w:pStyle w:val="FirstParagraph"/>
       </w:pPr>
       <w:r>
-        <w:t xml:space="preserve">Este es el formato en el que se entrega </w:t>
+        <w:t>Este es el formato e</w:t>
+      </w:r>
+      <w:r>
+        <w:t xml:space="preserve">n el que se entrega </w:t>
       </w:r>
       <w:r>
         <w:rPr>
@@ -1804,7 +1855,10 @@
         </w:numPr>
       </w:pPr>
       <w:r>
-        <w:t>Completa la carátula. Escribe los integrantes con apellidos, nombres y código, uno por línea.</w:t>
+        <w:t>Completa la carátula. Escribe los integrantes con apellido</w:t>
+      </w:r>
+      <w:r>
+        <w:t>s, nombres y código, uno por línea.</w:t>
       </w:r>
     </w:p>
     <w:p>
@@ -1896,75 +1950,261 @@
     </w:p>
     <w:p>
       <w:pPr>
-        <w:pStyle w:val="Heading1"/>
-      </w:pPr>
-      <w:bookmarkStart w:id="3" w:name="información-sobre-el-evento-práctico"/>
-      <w:bookmarkStart w:id="4" w:name="_Toc238735928"/>
-      <w:bookmarkEnd w:id="1"/>
+        <w:pStyle w:val="Ttulo1"/>
+      </w:pPr>
+      <w:bookmarkStart w:id="3" w:name="_Toc238735928"/>
+      <w:bookmarkStart w:id="4" w:name="información-sobre-el-evento-práctico"/>
+      <w:bookmarkEnd w:id="2"/>
       <w:r>
         <w:lastRenderedPageBreak/>
         <w:t>1. Información sobre el evento práctico</w:t>
       </w:r>
-      <w:bookmarkEnd w:id="4"/>
-    </w:p>
-    <w:p>
-      <w:pPr>
-        <w:pStyle w:val="Heading2"/>
-      </w:pPr>
-      <w:bookmarkStart w:id="5" w:name="título-del-evento-práctico"/>
-      <w:bookmarkStart w:id="6" w:name="_Toc238735929"/>
+      <w:bookmarkEnd w:id="3"/>
+    </w:p>
+    <w:p>
+      <w:pPr>
+        <w:pStyle w:val="Ttulo2"/>
+      </w:pPr>
+      <w:bookmarkStart w:id="5" w:name="_Toc238735929"/>
+      <w:bookmarkStart w:id="6" w:name="título-del-evento-práctico"/>
       <w:r>
         <w:t>1.1 Título del evento práctico</w:t>
       </w:r>
+      <w:bookmarkEnd w:id="5"/>
+    </w:p>
+    <w:p>
+      <w:pPr>
+        <w:pStyle w:val="Abstract"/>
+        <w:spacing w:line="360" w:lineRule="auto"/>
+        <w:jc w:val="both"/>
+        <w:rPr>
+          <w:sz w:val="22"/>
+        </w:rPr>
+      </w:pPr>
+      <w:r>
+        <w:rPr>
+          <w:sz w:val="22"/>
+        </w:rPr>
+        <w:t>Análisis documental comparado del Plan Estratégico Institucional y del Plan de Gobierno Digital de una entidad pública peruana, con verificación de su articulación y construcción del mapa de instrumentos de planeamiento aplicable a la organización objeto de estudio.</w:t>
+      </w:r>
+    </w:p>
+    <w:p>
+      <w:pPr>
+        <w:pStyle w:val="Ttulo2"/>
+      </w:pPr>
+      <w:bookmarkStart w:id="7" w:name="_Toc238735930"/>
+      <w:bookmarkStart w:id="8" w:name="objetivos"/>
       <w:bookmarkEnd w:id="6"/>
-    </w:p>
-    <w:p>
-      <w:pPr>
-        <w:pStyle w:val="Heading2"/>
-      </w:pPr>
-      <w:bookmarkStart w:id="7" w:name="objetivos"/>
-      <w:bookmarkStart w:id="8" w:name="_Toc238735930"/>
-      <w:bookmarkEnd w:id="5"/>
       <w:r>
         <w:t>1.2 Objetivos</w:t>
       </w:r>
+      <w:bookmarkEnd w:id="7"/>
+    </w:p>
+    <w:p>
+      <w:pPr>
+        <w:pStyle w:val="Textoindependiente"/>
+        <w:numPr>
+          <w:ilvl w:val="0"/>
+          <w:numId w:val="4"/>
+        </w:numPr>
+        <w:spacing w:line="360" w:lineRule="auto"/>
+        <w:rPr>
+          <w:lang w:val="es-PE"/>
+        </w:rPr>
+      </w:pPr>
+      <w:r>
+        <w:rPr>
+          <w:lang w:val="es-PE"/>
+        </w:rPr>
+        <w:t>Localizar y descargar el PEI y el PGD vigentes de una entidad pública peruana, ambos documentos públicos.</w:t>
+      </w:r>
+    </w:p>
+    <w:p>
+      <w:pPr>
+        <w:pStyle w:val="Textoindependiente"/>
+        <w:numPr>
+          <w:ilvl w:val="0"/>
+          <w:numId w:val="4"/>
+        </w:numPr>
+        <w:spacing w:line="360" w:lineRule="auto"/>
+        <w:rPr>
+          <w:lang w:val="es-PE"/>
+        </w:rPr>
+      </w:pPr>
+      <w:r>
+        <w:rPr>
+          <w:lang w:val="es-PE"/>
+        </w:rPr>
+        <w:t>Verificar la articulación entre ambos. Rastrear cada objetivo del PGD hasta un objetivo del PEI.</w:t>
+      </w:r>
+    </w:p>
+    <w:p>
+      <w:pPr>
+        <w:pStyle w:val="Textoindependiente"/>
+        <w:numPr>
+          <w:ilvl w:val="0"/>
+          <w:numId w:val="4"/>
+        </w:numPr>
+        <w:spacing w:line="360" w:lineRule="auto"/>
+        <w:rPr>
+          <w:lang w:val="es-PE"/>
+        </w:rPr>
+      </w:pPr>
+      <w:r>
+        <w:rPr>
+          <w:lang w:val="es-PE"/>
+        </w:rPr>
+        <w:t>Evaluar el PGD contra la estructura exigida por los Lineamientos de la RSGD 005-2018-PCM/SEGDI.</w:t>
+      </w:r>
+    </w:p>
+    <w:p>
+      <w:pPr>
+        <w:pStyle w:val="Textoindependiente"/>
+        <w:numPr>
+          <w:ilvl w:val="0"/>
+          <w:numId w:val="4"/>
+        </w:numPr>
+        <w:spacing w:line="360" w:lineRule="auto"/>
+        <w:rPr>
+          <w:lang w:val="es-PE"/>
+        </w:rPr>
+      </w:pPr>
+      <w:r>
+        <w:rPr>
+          <w:lang w:val="es-PE"/>
+        </w:rPr>
+        <w:t>Construir el mapa de instrumentos de planeamiento aplicable a la organización objeto de estudio.</w:t>
+      </w:r>
+    </w:p>
+    <w:p>
+      <w:pPr>
+        <w:pStyle w:val="Textoindependiente"/>
+        <w:numPr>
+          <w:ilvl w:val="0"/>
+          <w:numId w:val="4"/>
+        </w:numPr>
+        <w:spacing w:line="360" w:lineRule="auto"/>
+        <w:rPr>
+          <w:lang w:val="es-PE"/>
+        </w:rPr>
+      </w:pPr>
+      <w:r>
+        <w:rPr>
+          <w:lang w:val="es-PE"/>
+        </w:rPr>
+        <w:t>Determinar el objetivo superior de enganche del PETI (Plan Estratégico de Tecnologías de Información) que se está construyendo.</w:t>
+      </w:r>
+    </w:p>
+    <w:p>
+      <w:pPr>
+        <w:pStyle w:val="Textoindependiente"/>
+        <w:numPr>
+          <w:ilvl w:val="0"/>
+          <w:numId w:val="4"/>
+        </w:numPr>
+        <w:spacing w:line="360" w:lineRule="auto"/>
+        <w:rPr>
+          <w:lang w:val="es-PE"/>
+        </w:rPr>
+      </w:pPr>
+      <w:r>
+        <w:rPr>
+          <w:lang w:val="es-PE"/>
+        </w:rPr>
+        <w:t>Redactar la Sección 1.2 del PETI. Marco de planeamiento y articulación.</w:t>
+      </w:r>
+    </w:p>
+    <w:p>
+      <w:pPr>
+        <w:pStyle w:val="Ttulo2"/>
+      </w:pPr>
+      <w:bookmarkStart w:id="9" w:name="_Toc238735931"/>
+      <w:bookmarkStart w:id="10" w:name="tiempo-de-duración"/>
       <w:bookmarkEnd w:id="8"/>
-    </w:p>
-    <w:p>
-      <w:pPr>
-        <w:pStyle w:val="Heading2"/>
-      </w:pPr>
-      <w:bookmarkStart w:id="9" w:name="tiempo-de-duración"/>
-      <w:bookmarkStart w:id="10" w:name="_Toc238735931"/>
-      <w:bookmarkEnd w:id="7"/>
       <w:r>
         <w:t>1.3 Tiempo de duración</w:t>
       </w:r>
+      <w:bookmarkEnd w:id="9"/>
+    </w:p>
+    <w:p>
+      <w:pPr>
+        <w:pStyle w:val="Textoindependiente"/>
+        <w:spacing w:line="360" w:lineRule="auto"/>
+        <w:rPr>
+          <w:lang w:val="es-ES"/>
+        </w:rPr>
+      </w:pPr>
+      <w:r>
+        <w:rPr>
+          <w:lang w:val="es-ES"/>
+        </w:rPr>
+        <w:t>2 horas</w:t>
+      </w:r>
+    </w:p>
+    <w:p>
+      <w:pPr>
+        <w:pStyle w:val="Ttulo2"/>
+      </w:pPr>
+      <w:bookmarkStart w:id="11" w:name="_Toc238735932"/>
+      <w:bookmarkStart w:id="12" w:name="resultados-de-aprendizaje"/>
       <w:bookmarkEnd w:id="10"/>
-    </w:p>
-    <w:p>
-      <w:pPr>
-        <w:pStyle w:val="Heading2"/>
-      </w:pPr>
-      <w:bookmarkStart w:id="11" w:name="resultados-de-aprendizaje"/>
-      <w:bookmarkStart w:id="12" w:name="_Toc238735932"/>
-      <w:bookmarkEnd w:id="9"/>
-      <w:r>
-        <w:t>1.4 Resultados de aprendizaje</w:t>
-      </w:r>
+      <w:r>
+        <w:t xml:space="preserve">1.4 Resultados de </w:t>
+      </w:r>
+      <w:r>
+        <w:t>aprendizaje</w:t>
+      </w:r>
+      <w:bookmarkEnd w:id="11"/>
+    </w:p>
+    <w:p>
+      <w:pPr>
+        <w:pStyle w:val="Textoindependiente"/>
+        <w:numPr>
+          <w:ilvl w:val="0"/>
+          <w:numId w:val="5"/>
+        </w:numPr>
+        <w:spacing w:line="360" w:lineRule="auto"/>
+        <w:rPr>
+          <w:lang w:val="es-PE"/>
+        </w:rPr>
+      </w:pPr>
+      <w:r>
+        <w:rPr>
+          <w:lang w:val="es-PE"/>
+        </w:rPr>
+        <w:t>RA1 Aplica la dirección estratégica, definiendo la misión y visión.</w:t>
+      </w:r>
+    </w:p>
+    <w:p>
+      <w:pPr>
+        <w:pStyle w:val="Textoindependiente"/>
+        <w:numPr>
+          <w:ilvl w:val="0"/>
+          <w:numId w:val="5"/>
+        </w:numPr>
+        <w:spacing w:line="360" w:lineRule="auto"/>
+        <w:rPr>
+          <w:lang w:val="es-PE"/>
+        </w:rPr>
+      </w:pPr>
+      <w:r>
+        <w:rPr>
+          <w:lang w:val="es-PE"/>
+        </w:rPr>
+        <w:t>RA2 Desarrolla el análisis FODA.</w:t>
+      </w:r>
+    </w:p>
+    <w:p>
+      <w:pPr>
+        <w:pStyle w:val="Ttulo2"/>
+      </w:pPr>
+      <w:bookmarkStart w:id="13" w:name="_Toc238735933"/>
+      <w:bookmarkStart w:id="14" w:name="recursos"/>
       <w:bookmarkEnd w:id="12"/>
-    </w:p>
-    <w:p>
-      <w:pPr>
-        <w:pStyle w:val="Heading2"/>
-      </w:pPr>
-      <w:bookmarkStart w:id="13" w:name="recursos"/>
-      <w:bookmarkStart w:id="14" w:name="_Toc238735933"/>
-      <w:bookmarkEnd w:id="11"/>
       <w:r>
         <w:t>1.5 Recursos</w:t>
       </w:r>
-      <w:bookmarkEnd w:id="14"/>
+      <w:bookmarkEnd w:id="13"/>
     </w:p>
     <w:tbl>
       <w:tblPr>
@@ -1973,9 +2213,9 @@
         <w:tblLook w:val="0020" w:firstRow="1" w:lastRow="0" w:firstColumn="0" w:lastColumn="0" w:noHBand="0" w:noVBand="0"/>
       </w:tblPr>
       <w:tblGrid>
-        <w:gridCol w:w="1036"/>
-        <w:gridCol w:w="962"/>
-        <w:gridCol w:w="1819"/>
+        <w:gridCol w:w="1347"/>
+        <w:gridCol w:w="7605"/>
+        <w:gridCol w:w="618"/>
       </w:tblGrid>
       <w:tr>
         <w:trPr>
@@ -2004,7 +2244,7 @@
               <w:pStyle w:val="Compact"/>
             </w:pPr>
             <w:r>
-              <w:t>Versión</w:t>
+              <w:t>Detalle</w:t>
             </w:r>
           </w:p>
         </w:tc>
@@ -2031,6 +2271,9 @@
             <w:pPr>
               <w:pStyle w:val="Compact"/>
             </w:pPr>
+            <w:r>
+              <w:t>Portal del Estado Peruano</w:t>
+            </w:r>
           </w:p>
         </w:tc>
         <w:tc>
@@ -2041,6 +2284,9 @@
             <w:pPr>
               <w:pStyle w:val="Compact"/>
             </w:pPr>
+            <w:r>
+              <w:t>https://www.gob.pe — sección de transparencia de la SUNAT</w:t>
+            </w:r>
           </w:p>
         </w:tc>
         <w:tc>
@@ -2063,6 +2309,9 @@
             <w:pPr>
               <w:pStyle w:val="Compact"/>
             </w:pPr>
+            <w:r>
+              <w:t>CEPLAN</w:t>
+            </w:r>
           </w:p>
         </w:tc>
         <w:tc>
@@ -2073,6 +2322,9 @@
             <w:pPr>
               <w:pStyle w:val="Compact"/>
             </w:pPr>
+            <w:r>
+              <w:t>https://www.gob.pe/ceplan — Guía para el Planeamiento Institucional</w:t>
+            </w:r>
           </w:p>
         </w:tc>
         <w:tc>
@@ -2095,6 +2347,9 @@
             <w:pPr>
               <w:pStyle w:val="Compact"/>
             </w:pPr>
+            <w:r>
+              <w:t>Lineamientos del PGD</w:t>
+            </w:r>
           </w:p>
         </w:tc>
         <w:tc>
@@ -2105,6 +2360,9 @@
             <w:pPr>
               <w:pStyle w:val="Compact"/>
             </w:pPr>
+            <w:r>
+              <w:t>https://cdn.www.gob.pe/uploads/document/file/356863/Anexo_I_Lineamientos_PGD.pdf</w:t>
+            </w:r>
           </w:p>
         </w:tc>
         <w:tc>
@@ -2121,92 +2379,231 @@
     </w:tbl>
     <w:p>
       <w:pPr>
-        <w:pStyle w:val="Heading2"/>
-      </w:pPr>
-      <w:bookmarkStart w:id="15" w:name="seguridad"/>
-      <w:bookmarkStart w:id="16" w:name="_Toc238735934"/>
-      <w:bookmarkEnd w:id="13"/>
-      <w:r>
+        <w:pStyle w:val="Ttulo2"/>
+      </w:pPr>
+      <w:bookmarkStart w:id="15" w:name="_Toc238735934"/>
+      <w:bookmarkStart w:id="16" w:name="seguridad"/>
+      <w:bookmarkEnd w:id="14"/>
+      <w:r>
+        <w:lastRenderedPageBreak/>
         <w:t>1.6 Seguridad</w:t>
       </w:r>
+      <w:bookmarkEnd w:id="15"/>
+    </w:p>
+    <w:p>
+      <w:pPr>
+        <w:pStyle w:val="FirstParagraph"/>
+      </w:pPr>
+      <w:r>
+        <w:t>Reglas de uso del laboratorio y de alcance que se respetaron durante el trabajo.</w:t>
+      </w:r>
+    </w:p>
+    <w:p>
+      <w:pPr>
+        <w:pStyle w:val="Ttulo1"/>
+      </w:pPr>
+      <w:bookmarkStart w:id="17" w:name="_Toc238735935"/>
+      <w:bookmarkStart w:id="18" w:name="procedimiento-o-metodología"/>
+      <w:bookmarkEnd w:id="4"/>
       <w:bookmarkEnd w:id="16"/>
+      <w:r>
+        <w:t>2. Procedimiento o metodología</w:t>
+      </w:r>
+      <w:bookmarkEnd w:id="17"/>
     </w:p>
     <w:p>
       <w:pPr>
         <w:pStyle w:val="FirstParagraph"/>
       </w:pPr>
       <w:r>
-        <w:t>Reglas de uso del laboratorio y de alcance que se respetaron durante el trabajo.</w:t>
-      </w:r>
-    </w:p>
-    <w:p>
-      <w:pPr>
-        <w:pStyle w:val="Heading1"/>
-      </w:pPr>
-      <w:bookmarkStart w:id="17" w:name="procedimiento-o-metodología"/>
-      <w:bookmarkStart w:id="18" w:name="_Toc238735935"/>
-      <w:bookmarkEnd w:id="3"/>
-      <w:bookmarkEnd w:id="15"/>
-      <w:r>
-        <w:t>2. Procedimiento o metodología</w:t>
-      </w:r>
+        <w:t xml:space="preserve">Cada paso lleva su título, qué se buscaba, el comando o la </w:t>
+      </w:r>
+      <w:r>
+        <w:t>acción, y la evidencia de que funcionó. Quien lea el informe debe poder repetir el trabajo sin preguntar nada.</w:t>
+      </w:r>
+    </w:p>
+    <w:p>
+      <w:pPr>
+        <w:pStyle w:val="Ttulo2"/>
+      </w:pPr>
+      <w:bookmarkStart w:id="19" w:name="_Toc238735936"/>
+      <w:bookmarkStart w:id="20" w:name="paso-a"/>
+      <w:r>
+        <w:t>Paso A</w:t>
+      </w:r>
+      <w:bookmarkEnd w:id="19"/>
+    </w:p>
+    <w:p>
+      <w:pPr>
+        <w:pStyle w:val="Textoindependiente"/>
+        <w:spacing w:line="360" w:lineRule="auto"/>
+      </w:pPr>
+      <w:r>
+        <w:t>Se seleccionó a la Superintendencia Nacional de Aduanas y de Administración Tributaria (SUNAT). Se procedió a descargar desde gob.pe el Plan Estratégico Institucional (PEI) 2026-2030 (Aprobado por Res. 000395-2025) y el Plan de Gobierno Digital (PGD) 2025-2027 (Aprobado por Res. 000301-2024). Los archivos PDF de los Anexos se guardaron en la carpeta evidencias/.</w:t>
+      </w:r>
+    </w:p>
+    <w:p>
+      <w:pPr>
+        <w:pStyle w:val="Ttulo2"/>
+      </w:pPr>
+      <w:bookmarkStart w:id="21" w:name="_Toc238735937"/>
+      <w:bookmarkStart w:id="22" w:name="paso-b"/>
+      <w:bookmarkEnd w:id="20"/>
+      <w:r>
+        <w:t>Paso B</w:t>
+      </w:r>
+      <w:bookmarkEnd w:id="21"/>
+    </w:p>
+    <w:p>
+      <w:pPr>
+        <w:pStyle w:val="Textoindependiente"/>
+        <w:spacing w:line="360" w:lineRule="auto"/>
+      </w:pPr>
+      <w:r>
+        <w:t>Se ejecutaron los scripts de Python MP02_extraccion.py y MP03_objetivos.py provistos por el taller, haciendo uso de la librería pdfplumber para leer ambos PDFs. Se logró identificar 24 objetivos en el PEI y 5 Objetivos de Gobierno Digital (OGD) en el PGD. Los resultados se guardaron en la carpeta 01_marco/ en archivos .csv.</w:t>
+      </w:r>
+    </w:p>
+    <w:p>
+      <w:pPr>
+        <w:pStyle w:val="Ttulo2"/>
+      </w:pPr>
+      <w:bookmarkStart w:id="23" w:name="_Toc238735938"/>
+      <w:bookmarkStart w:id="24" w:name="paso-c"/>
+      <w:bookmarkEnd w:id="22"/>
+      <w:r>
+        <w:t>Paso C</w:t>
+      </w:r>
+      <w:bookmarkEnd w:id="23"/>
+    </w:p>
+    <w:p>
+      <w:pPr>
+        <w:pStyle w:val="Textoindependiente"/>
+        <w:spacing w:line="360" w:lineRule="auto"/>
+      </w:pPr>
+      <w:r>
+        <w:t>Utilizando los objetivos extraídos, se analizó la "Matriz de Vinculación" presente en el PGD (páginas 63-66). Se llenó la tabla MP04_articulacion.csv confirmando qué OEI del PEI corresponde a cada OGD. Finalmente, se ejecutó el script MP05_calidad.py arrojando un 100% de objetivos completos (articulados, con indicador, línea base y meta).</w:t>
+      </w:r>
+    </w:p>
+    <w:p>
+      <w:pPr>
+        <w:pStyle w:val="Ttulo2"/>
+        <w:rPr>
+          <w:lang w:val="es-ES"/>
+        </w:rPr>
+      </w:pPr>
+      <w:bookmarkStart w:id="25" w:name="_Hlk239350734"/>
+      <w:r>
+        <w:t xml:space="preserve">Paso </w:t>
+      </w:r>
+      <w:r>
+        <w:rPr>
+          <w:lang w:val="es-ES"/>
+        </w:rPr>
+        <w:t>D</w:t>
+      </w:r>
+    </w:p>
+    <w:bookmarkEnd w:id="25"/>
+    <w:p>
+      <w:pPr>
+        <w:pStyle w:val="Textoindependiente"/>
+        <w:spacing w:line="360" w:lineRule="auto"/>
+        <w:rPr>
+          <w:lang w:val="es-ES"/>
+        </w:rPr>
+      </w:pPr>
+      <w:r>
+        <w:rPr>
+          <w:lang w:val="es-ES"/>
+        </w:rPr>
+        <w:t>Se construyó el diagrama mapa_instrumentos.png mostrando la jerarquía de instrumentos para la SUNAT (pública). Asimismo, se llenó la tabla MP07_instrumentos_organizacion.csv con la vigencia y el estado de aprobación formal de cada uno.</w:t>
+      </w:r>
+    </w:p>
+    <w:p>
+      <w:pPr>
+        <w:pStyle w:val="Ttulo2"/>
+        <w:rPr>
+          <w:lang w:val="es-ES"/>
+        </w:rPr>
+      </w:pPr>
+      <w:r>
+        <w:t xml:space="preserve">Paso </w:t>
+      </w:r>
+      <w:r>
+        <w:rPr>
+          <w:lang w:val="es-ES"/>
+        </w:rPr>
+        <w:t>E</w:t>
+      </w:r>
+    </w:p>
+    <w:p>
+      <w:pPr>
+        <w:pStyle w:val="Textoindependiente"/>
+        <w:spacing w:line="360" w:lineRule="auto"/>
+        <w:rPr>
+          <w:lang w:val="es-ES"/>
+        </w:rPr>
+      </w:pPr>
+      <w:r>
+        <w:rPr>
+          <w:lang w:val="es-ES"/>
+        </w:rPr>
+        <w:t>Con toda la información recolectada y analizada, se redactó el archivo 1.2_marco_planeamiento.md incluyendo la justificación del objetivo superior de enganche, el esquema normativo y la lección aprendida del análisis comparado.</w:t>
+      </w:r>
+    </w:p>
+    <w:p>
+      <w:pPr>
+        <w:pStyle w:val="Textoindependiente"/>
+        <w:spacing w:line="360" w:lineRule="auto"/>
+        <w:rPr>
+          <w:lang w:val="es-ES"/>
+        </w:rPr>
+      </w:pPr>
+    </w:p>
+    <w:p>
+      <w:pPr>
+        <w:pStyle w:val="Textoindependiente"/>
+        <w:spacing w:line="360" w:lineRule="auto"/>
+        <w:rPr>
+          <w:lang w:val="es-ES"/>
+        </w:rPr>
+      </w:pPr>
+    </w:p>
+    <w:p>
+      <w:pPr>
+        <w:pStyle w:val="Textoindependiente"/>
+        <w:spacing w:line="360" w:lineRule="auto"/>
+        <w:rPr>
+          <w:lang w:val="es-ES"/>
+        </w:rPr>
+      </w:pPr>
+    </w:p>
+    <w:p>
+      <w:pPr>
+        <w:pStyle w:val="Textoindependiente"/>
+        <w:spacing w:line="360" w:lineRule="auto"/>
+        <w:rPr>
+          <w:lang w:val="es-ES"/>
+        </w:rPr>
+      </w:pPr>
+      <w:bookmarkStart w:id="26" w:name="_GoBack"/>
+      <w:bookmarkEnd w:id="26"/>
+    </w:p>
+    <w:p>
+      <w:pPr>
+        <w:pStyle w:val="Ttulo1"/>
+      </w:pPr>
+      <w:bookmarkStart w:id="27" w:name="_Toc238735939"/>
+      <w:bookmarkStart w:id="28" w:name="resultados"/>
       <w:bookmarkEnd w:id="18"/>
-    </w:p>
-    <w:p>
-      <w:pPr>
-        <w:pStyle w:val="FirstParagraph"/>
-      </w:pPr>
-      <w:r>
-        <w:t>Cada paso lleva su título, qué se buscaba, el comando o la acción, y la evidencia de que funcionó. Quien lea el informe debe poder repetir el trabajo sin preguntar nada.</w:t>
-      </w:r>
-    </w:p>
-    <w:p>
-      <w:pPr>
-        <w:pStyle w:val="Heading2"/>
-      </w:pPr>
-      <w:bookmarkStart w:id="19" w:name="paso-a"/>
-      <w:bookmarkStart w:id="20" w:name="_Toc238735936"/>
-      <w:r>
-        <w:t>Paso A</w:t>
-      </w:r>
-      <w:bookmarkEnd w:id="20"/>
-    </w:p>
-    <w:p>
-      <w:pPr>
-        <w:pStyle w:val="Heading2"/>
-      </w:pPr>
-      <w:bookmarkStart w:id="21" w:name="paso-b"/>
-      <w:bookmarkStart w:id="22" w:name="_Toc238735937"/>
-      <w:bookmarkEnd w:id="19"/>
-      <w:r>
-        <w:t>Paso B</w:t>
-      </w:r>
-      <w:bookmarkEnd w:id="22"/>
-    </w:p>
-    <w:p>
-      <w:pPr>
-        <w:pStyle w:val="Heading2"/>
-      </w:pPr>
-      <w:bookmarkStart w:id="23" w:name="paso-c"/>
-      <w:bookmarkStart w:id="24" w:name="_Toc238735938"/>
-      <w:bookmarkEnd w:id="21"/>
-      <w:r>
-        <w:t>Paso C</w:t>
-      </w:r>
       <w:bookmarkEnd w:id="24"/>
-    </w:p>
-    <w:p>
-      <w:pPr>
-        <w:pStyle w:val="Heading1"/>
-      </w:pPr>
-      <w:bookmarkStart w:id="25" w:name="resultados"/>
-      <w:bookmarkStart w:id="26" w:name="_Toc238735939"/>
-      <w:bookmarkEnd w:id="17"/>
-      <w:bookmarkEnd w:id="23"/>
-      <w:r>
-        <w:t>3. Resultados</w:t>
-      </w:r>
-      <w:bookmarkEnd w:id="26"/>
+      <w:r>
+        <w:lastRenderedPageBreak/>
+        <w:t>3</w:t>
+      </w:r>
+      <w:r>
+        <w:t>. Resultados</w:t>
+      </w:r>
+      <w:bookmarkEnd w:id="27"/>
     </w:p>
     <w:tbl>
       <w:tblPr>
@@ -2641,23 +3038,26 @@
     </w:tbl>
     <w:p>
       <w:pPr>
-        <w:pStyle w:val="BodyText"/>
-      </w:pPr>
-      <w:r>
-        <w:t>Si algo no se logró, explícalo aquí. Un resultado no alcanzado y bien explicado vale más que uno declarado sin evidencia.</w:t>
-      </w:r>
-    </w:p>
-    <w:p>
-      <w:pPr>
-        <w:pStyle w:val="Heading1"/>
-      </w:pPr>
-      <w:bookmarkStart w:id="27" w:name="conclusiones"/>
-      <w:bookmarkStart w:id="28" w:name="_Toc238735940"/>
-      <w:bookmarkEnd w:id="25"/>
+        <w:pStyle w:val="Textoindependiente"/>
+      </w:pPr>
+      <w:r>
+        <w:t xml:space="preserve">Si algo no se </w:t>
+      </w:r>
+      <w:r>
+        <w:t>logró, explícalo aquí. Un resultado no alcanzado y bien explicado vale más que uno declarado sin evidencia.</w:t>
+      </w:r>
+    </w:p>
+    <w:p>
+      <w:pPr>
+        <w:pStyle w:val="Ttulo1"/>
+      </w:pPr>
+      <w:bookmarkStart w:id="29" w:name="_Toc238735940"/>
+      <w:bookmarkStart w:id="30" w:name="conclusiones"/>
+      <w:bookmarkEnd w:id="28"/>
       <w:r>
         <w:t>4. Conclusiones</w:t>
       </w:r>
-      <w:bookmarkEnd w:id="28"/>
+      <w:bookmarkEnd w:id="29"/>
     </w:p>
     <w:p>
       <w:pPr>
@@ -2669,15 +3069,18 @@
     </w:p>
     <w:p>
       <w:pPr>
-        <w:pStyle w:val="Heading1"/>
-      </w:pPr>
-      <w:bookmarkStart w:id="29" w:name="cuestionario"/>
-      <w:bookmarkStart w:id="30" w:name="_Toc238735941"/>
-      <w:bookmarkEnd w:id="27"/>
-      <w:r>
-        <w:t>5. Cuestionario</w:t>
-      </w:r>
+        <w:pStyle w:val="Ttulo1"/>
+      </w:pPr>
+      <w:bookmarkStart w:id="31" w:name="_Toc238735941"/>
+      <w:bookmarkStart w:id="32" w:name="cuestionario"/>
       <w:bookmarkEnd w:id="30"/>
+      <w:r>
+        <w:t>5. Cuest</w:t>
+      </w:r>
+      <w:r>
+        <w:t>ionario</w:t>
+      </w:r>
+      <w:bookmarkEnd w:id="31"/>
     </w:p>
     <w:p>
       <w:pPr>
@@ -2689,36 +3092,38 @@
     </w:p>
     <w:p>
       <w:pPr>
-        <w:pStyle w:val="Heading1"/>
-      </w:pPr>
-      <w:bookmarkStart w:id="31" w:name="referencias-bibliográficas"/>
-      <w:bookmarkStart w:id="32" w:name="_Toc238735942"/>
-      <w:bookmarkEnd w:id="29"/>
-      <w:r>
-        <w:lastRenderedPageBreak/>
+        <w:pStyle w:val="Ttulo1"/>
+      </w:pPr>
+      <w:bookmarkStart w:id="33" w:name="_Toc238735942"/>
+      <w:bookmarkStart w:id="34" w:name="referencias-bibliográficas"/>
+      <w:bookmarkEnd w:id="32"/>
+      <w:r>
         <w:t>6. Referencias bibliográficas</w:t>
       </w:r>
-      <w:bookmarkEnd w:id="32"/>
+      <w:bookmarkEnd w:id="33"/>
     </w:p>
     <w:p>
       <w:pPr>
         <w:pStyle w:val="FirstParagraph"/>
       </w:pPr>
       <w:r>
-        <w:t>Normas técnicas, marcos profesionales, documentación oficial y bibliografía indexada, en formato APA. No se admiten wikis abiertas ni sitios sin autoría verificable.</w:t>
-      </w:r>
-    </w:p>
-    <w:p>
-      <w:pPr>
-        <w:pStyle w:val="Heading1"/>
-      </w:pPr>
-      <w:bookmarkStart w:id="33" w:name="anexos"/>
-      <w:bookmarkStart w:id="34" w:name="_Toc238735943"/>
-      <w:bookmarkEnd w:id="31"/>
+        <w:t xml:space="preserve">Normas técnicas, marcos profesionales, documentación oficial y bibliografía indexada, en formato APA. No se admiten wikis abiertas ni sitios sin autoría </w:t>
+      </w:r>
+      <w:r>
+        <w:t>verificable.</w:t>
+      </w:r>
+    </w:p>
+    <w:p>
+      <w:pPr>
+        <w:pStyle w:val="Ttulo1"/>
+      </w:pPr>
+      <w:bookmarkStart w:id="35" w:name="_Toc238735943"/>
+      <w:bookmarkStart w:id="36" w:name="anexos"/>
+      <w:bookmarkEnd w:id="34"/>
       <w:r>
         <w:t>7. Anexos</w:t>
       </w:r>
-      <w:bookmarkEnd w:id="34"/>
+      <w:bookmarkEnd w:id="35"/>
     </w:p>
     <w:p>
       <w:pPr>
@@ -2727,7 +3132,7 @@
       <w:r>
         <w:t>Capturas completas, archivos de configuración y salidas extensas. Cada anexo lleva su letra y su título, y se menciona en el cuerpo del informe.</w:t>
       </w:r>
-      <w:bookmarkEnd w:id="33"/>
+      <w:bookmarkEnd w:id="36"/>
     </w:p>
     <w:sectPr>
       <w:headerReference w:type="default" r:id="rId8"/>
@@ -2744,7 +3149,7 @@
 </file>
 
 <file path=word/endnotes.xml><?xml version="1.0" encoding="utf-8"?>
-<w:endnotes xmlns:wpc="http://schemas.microsoft.com/office/word/2010/wordprocessingCanvas" xmlns:cx="http://schemas.microsoft.com/office/drawing/2014/chartex" xmlns:cx1="http://schemas.microsoft.com/office/drawing/2015/9/8/chartex" xmlns:cx2="http://schemas.microsoft.com/office/drawing/2015/10/21/chartex" xmlns:cx3="http://schemas.microsoft.com/office/drawing/2016/5/9/chartex" xmlns:cx4="http://schemas.microsoft.com/office/drawing/2016/5/10/chartex" xmlns:cx5="http://schemas.microsoft.com/office/drawing/2016/5/11/chartex" xmlns:cx6="http://schemas.microsoft.com/office/drawing/2016/5/12/chartex" xmlns:cx7="http://schemas.microsoft.com/office/drawing/2016/5/13/chartex" xmlns:cx8="http://schemas.microsoft.com/office/drawing/2016/5/14/chartex" xmlns:mc="http://schemas.openxmlformats.org/markup-compatibility/2006" xmlns:m="http://schemas.openxmlformats.org/officeDocument/2006/math" xmlns:aink="http://schemas.microsoft.com/office/drawing/2016/ink" xmlns:am3d="http://schemas.microsoft.com/office/drawing/2017/model3d" xmlns:oel="http://schemas.microsoft.com/office/2019/extlst" xmlns:r="http://schemas.openxmlformats.org/officeDocument/2006/relationships" xmlns:wp14="http://schemas.microsoft.com/office/word/2010/wordprocessingDrawing" xmlns:wp="http://schemas.openxmlformats.org/drawingml/2006/wordprocessingDrawing" xmlns:wpg="http://schemas.microsoft.com/office/word/2010/wordprocessingGroup" xmlns:wpi="http://schemas.microsoft.com/office/word/2010/wordprocessingInk" xmlns:wps="http://schemas.microsoft.com/office/word/2010/wordprocessingShape" xmlns:o="urn:schemas-microsoft-com:office:office" xmlns:v="urn:schemas-microsoft-com:vml" xmlns:w10="urn:schemas-microsoft-com:office:word" xmlns:w="http://schemas.openxmlformats.org/wordprocessingml/2006/main" xmlns:w14="http://schemas.microsoft.com/office/word/2010/wordml" xmlns:w15="http://schemas.microsoft.com/office/word/2012/wordml" xmlns:w16cex="http://schemas.microsoft.com/office/word/2018/wordml/cex" xmlns:w16cid="http://schemas.microsoft.com/office/word/2016/wordml/cid" xmlns:w16="http://schemas.microsoft.com/office/word/2018/wordml" xmlns:w16sdtdh="http://schemas.microsoft.com/office/word/2020/wordml/sdtdatahash" xmlns:w16sdtfl="http://schemas.microsoft.com/office/word/2024/wordml/sdtformatlock" xmlns:w16se="http://schemas.microsoft.com/office/word/2015/wordml/symex" xmlns:w16du="http://schemas.microsoft.com/office/word/2023/wordml/word16du" xmlns:wne="http://schemas.microsoft.com/office/word/2006/wordml" mc:Ignorable="w14 w15 w16se w16cid w16 w16cex w16sdtdh w16sdtfl w16du wp14">
+<w:endnotes xmlns:wpc="http://schemas.microsoft.com/office/word/2010/wordprocessingCanvas" xmlns:cx="http://schemas.microsoft.com/office/drawing/2014/chartex" xmlns:cx1="http://schemas.microsoft.com/office/drawing/2015/9/8/chartex" xmlns:cx2="http://schemas.microsoft.com/office/drawing/2015/10/21/chartex" xmlns:cx3="http://schemas.microsoft.com/office/drawing/2016/5/9/chartex" xmlns:cx4="http://schemas.microsoft.com/office/drawing/2016/5/10/chartex" xmlns:cx5="http://schemas.microsoft.com/office/drawing/2016/5/11/chartex" xmlns:cx6="http://schemas.microsoft.com/office/drawing/2016/5/12/chartex" xmlns:cx7="http://schemas.microsoft.com/office/drawing/2016/5/13/chartex" xmlns:cx8="http://schemas.microsoft.com/office/drawing/2016/5/14/chartex" xmlns:mc="http://schemas.openxmlformats.org/markup-compatibility/2006" xmlns:aink="http://schemas.microsoft.com/office/drawing/2016/ink" xmlns:am3d="http://schemas.microsoft.com/office/drawing/2017/model3d" xmlns:o="urn:schemas-microsoft-com:office:office" xmlns:r="http://schemas.openxmlformats.org/officeDocument/2006/relationships" xmlns:m="http://schemas.openxmlformats.org/officeDocument/2006/math" xmlns:v="urn:schemas-microsoft-com:vml" xmlns:wp14="http://schemas.microsoft.com/office/word/2010/wordprocessingDrawing" xmlns:wp="http://schemas.openxmlformats.org/drawingml/2006/wordprocessingDrawing" xmlns:w10="urn:schemas-microsoft-com:office:word" xmlns:w="http://schemas.openxmlformats.org/wordprocessingml/2006/main" xmlns:w14="http://schemas.microsoft.com/office/word/2010/wordml" xmlns:w15="http://schemas.microsoft.com/office/word/2012/wordml" xmlns:w16cid="http://schemas.microsoft.com/office/word/2016/wordml/cid" xmlns:w16se="http://schemas.microsoft.com/office/word/2015/wordml/symex" xmlns:wpg="http://schemas.microsoft.com/office/word/2010/wordprocessingGroup" xmlns:wpi="http://schemas.microsoft.com/office/word/2010/wordprocessingInk" xmlns:wne="http://schemas.microsoft.com/office/word/2006/wordml" xmlns:wps="http://schemas.microsoft.com/office/word/2010/wordprocessingShape" mc:Ignorable="w14 w15 w16se w16cid wp14">
   <w:endnote w:type="separator" w:id="-1">
     <w:p>
       <w:pPr>
@@ -2769,7 +3174,7 @@
 </file>
 
 <file path=word/footer1.xml><?xml version="1.0" encoding="utf-8"?>
-<w:ftr xmlns:wpc="http://schemas.microsoft.com/office/word/2010/wordprocessingCanvas" xmlns:cx="http://schemas.microsoft.com/office/drawing/2014/chartex" xmlns:cx1="http://schemas.microsoft.com/office/drawing/2015/9/8/chartex" xmlns:cx2="http://schemas.microsoft.com/office/drawing/2015/10/21/chartex" xmlns:cx3="http://schemas.microsoft.com/office/drawing/2016/5/9/chartex" xmlns:cx4="http://schemas.microsoft.com/office/drawing/2016/5/10/chartex" xmlns:cx5="http://schemas.microsoft.com/office/drawing/2016/5/11/chartex" xmlns:cx6="http://schemas.microsoft.com/office/drawing/2016/5/12/chartex" xmlns:cx7="http://schemas.microsoft.com/office/drawing/2016/5/13/chartex" xmlns:cx8="http://schemas.microsoft.com/office/drawing/2016/5/14/chartex" xmlns:mc="http://schemas.openxmlformats.org/markup-compatibility/2006" xmlns:m="http://schemas.openxmlformats.org/officeDocument/2006/math" xmlns:aink="http://schemas.microsoft.com/office/drawing/2016/ink" xmlns:am3d="http://schemas.microsoft.com/office/drawing/2017/model3d" xmlns:oel="http://schemas.microsoft.com/office/2019/extlst" xmlns:r="http://schemas.openxmlformats.org/officeDocument/2006/relationships" xmlns:wp14="http://schemas.microsoft.com/office/word/2010/wordprocessingDrawing" xmlns:wp="http://schemas.openxmlformats.org/drawingml/2006/wordprocessingDrawing" xmlns:wpg="http://schemas.microsoft.com/office/word/2010/wordprocessingGroup" xmlns:wpi="http://schemas.microsoft.com/office/word/2010/wordprocessingInk" xmlns:wps="http://schemas.microsoft.com/office/word/2010/wordprocessingShape" xmlns:o="urn:schemas-microsoft-com:office:office" xmlns:v="urn:schemas-microsoft-com:vml" xmlns:w10="urn:schemas-microsoft-com:office:word" xmlns:w="http://schemas.openxmlformats.org/wordprocessingml/2006/main" xmlns:w14="http://schemas.microsoft.com/office/word/2010/wordml" xmlns:w15="http://schemas.microsoft.com/office/word/2012/wordml" xmlns:w16cex="http://schemas.microsoft.com/office/word/2018/wordml/cex" xmlns:w16cid="http://schemas.microsoft.com/office/word/2016/wordml/cid" xmlns:w16="http://schemas.microsoft.com/office/word/2018/wordml" xmlns:w16sdtdh="http://schemas.microsoft.com/office/word/2020/wordml/sdtdatahash" xmlns:w16sdtfl="http://schemas.microsoft.com/office/word/2024/wordml/sdtformatlock" xmlns:w16se="http://schemas.microsoft.com/office/word/2015/wordml/symex" xmlns:w16du="http://schemas.microsoft.com/office/word/2023/wordml/word16du" xmlns:wne="http://schemas.microsoft.com/office/word/2006/wordml" mc:Ignorable="w14 w15 w16se w16cid w16 w16cex w16sdtdh w16sdtfl w16du wp14">
+<w:ftr xmlns:wpc="http://schemas.microsoft.com/office/word/2010/wordprocessingCanvas" xmlns:cx="http://schemas.microsoft.com/office/drawing/2014/chartex" xmlns:cx1="http://schemas.microsoft.com/office/drawing/2015/9/8/chartex" xmlns:cx2="http://schemas.microsoft.com/office/drawing/2015/10/21/chartex" xmlns:cx3="http://schemas.microsoft.com/office/drawing/2016/5/9/chartex" xmlns:cx4="http://schemas.microsoft.com/office/drawing/2016/5/10/chartex" xmlns:cx5="http://schemas.microsoft.com/office/drawing/2016/5/11/chartex" xmlns:cx6="http://schemas.microsoft.com/office/drawing/2016/5/12/chartex" xmlns:cx7="http://schemas.microsoft.com/office/drawing/2016/5/13/chartex" xmlns:cx8="http://schemas.microsoft.com/office/drawing/2016/5/14/chartex" xmlns:mc="http://schemas.openxmlformats.org/markup-compatibility/2006" xmlns:aink="http://schemas.microsoft.com/office/drawing/2016/ink" xmlns:am3d="http://schemas.microsoft.com/office/drawing/2017/model3d" xmlns:o="urn:schemas-microsoft-com:office:office" xmlns:r="http://schemas.openxmlformats.org/officeDocument/2006/relationships" xmlns:m="http://schemas.openxmlformats.org/officeDocument/2006/math" xmlns:v="urn:schemas-microsoft-com:vml" xmlns:wp14="http://schemas.microsoft.com/office/word/2010/wordprocessingDrawing" xmlns:wp="http://schemas.openxmlformats.org/drawingml/2006/wordprocessingDrawing" xmlns:w10="urn:schemas-microsoft-com:office:word" xmlns:w="http://schemas.openxmlformats.org/wordprocessingml/2006/main" xmlns:w14="http://schemas.microsoft.com/office/word/2010/wordml" xmlns:w15="http://schemas.microsoft.com/office/word/2012/wordml" xmlns:w16cid="http://schemas.microsoft.com/office/word/2016/wordml/cid" xmlns:w16se="http://schemas.microsoft.com/office/word/2015/wordml/symex" xmlns:wpg="http://schemas.microsoft.com/office/word/2010/wordprocessingGroup" xmlns:wpi="http://schemas.microsoft.com/office/word/2010/wordprocessingInk" xmlns:wne="http://schemas.microsoft.com/office/word/2006/wordml" xmlns:wps="http://schemas.microsoft.com/office/word/2010/wordprocessingShape" mc:Ignorable="w14 w15 w16se w16cid wp14">
   <w:p>
     <w:pPr>
       <w:pBdr>
@@ -2824,7 +3229,7 @@
 </file>
 
 <file path=word/footnotes.xml><?xml version="1.0" encoding="utf-8"?>
-<w:footnotes xmlns:wpc="http://schemas.microsoft.com/office/word/2010/wordprocessingCanvas" xmlns:cx="http://schemas.microsoft.com/office/drawing/2014/chartex" xmlns:cx1="http://schemas.microsoft.com/office/drawing/2015/9/8/chartex" xmlns:cx2="http://schemas.microsoft.com/office/drawing/2015/10/21/chartex" xmlns:cx3="http://schemas.microsoft.com/office/drawing/2016/5/9/chartex" xmlns:cx4="http://schemas.microsoft.com/office/drawing/2016/5/10/chartex" xmlns:cx5="http://schemas.microsoft.com/office/drawing/2016/5/11/chartex" xmlns:cx6="http://schemas.microsoft.com/office/drawing/2016/5/12/chartex" xmlns:cx7="http://schemas.microsoft.com/office/drawing/2016/5/13/chartex" xmlns:cx8="http://schemas.microsoft.com/office/drawing/2016/5/14/chartex" xmlns:mc="http://schemas.openxmlformats.org/markup-compatibility/2006" xmlns:m="http://schemas.openxmlformats.org/officeDocument/2006/math" xmlns:aink="http://schemas.microsoft.com/office/drawing/2016/ink" xmlns:am3d="http://schemas.microsoft.com/office/drawing/2017/model3d" xmlns:oel="http://schemas.microsoft.com/office/2019/extlst" xmlns:r="http://schemas.openxmlformats.org/officeDocument/2006/relationships" xmlns:wp14="http://schemas.microsoft.com/office/word/2010/wordprocessingDrawing" xmlns:wp="http://schemas.openxmlformats.org/drawingml/2006/wordprocessingDrawing" xmlns:wpg="http://schemas.microsoft.com/office/word/2010/wordprocessingGroup" xmlns:wpi="http://schemas.microsoft.com/office/word/2010/wordprocessingInk" xmlns:wps="http://schemas.microsoft.com/office/word/2010/wordprocessingShape" xmlns:o="urn:schemas-microsoft-com:office:office" xmlns:v="urn:schemas-microsoft-com:vml" xmlns:w10="urn:schemas-microsoft-com:office:word" xmlns:w="http://schemas.openxmlformats.org/wordprocessingml/2006/main" xmlns:w14="http://schemas.microsoft.com/office/word/2010/wordml" xmlns:w15="http://schemas.microsoft.com/office/word/2012/wordml" xmlns:w16cex="http://schemas.microsoft.com/office/word/2018/wordml/cex" xmlns:w16cid="http://schemas.microsoft.com/office/word/2016/wordml/cid" xmlns:w16="http://schemas.microsoft.com/office/word/2018/wordml" xmlns:w16sdtdh="http://schemas.microsoft.com/office/word/2020/wordml/sdtdatahash" xmlns:w16sdtfl="http://schemas.microsoft.com/office/word/2024/wordml/sdtformatlock" xmlns:w16se="http://schemas.microsoft.com/office/word/2015/wordml/symex" xmlns:w16du="http://schemas.microsoft.com/office/word/2023/wordml/word16du" xmlns:wne="http://schemas.microsoft.com/office/word/2006/wordml" mc:Ignorable="w14 w15 w16se w16cid w16 w16cex w16sdtdh w16sdtfl w16du wp14">
+<w:footnotes xmlns:wpc="http://schemas.microsoft.com/office/word/2010/wordprocessingCanvas" xmlns:cx="http://schemas.microsoft.com/office/drawing/2014/chartex" xmlns:cx1="http://schemas.microsoft.com/office/drawing/2015/9/8/chartex" xmlns:cx2="http://schemas.microsoft.com/office/drawing/2015/10/21/chartex" xmlns:cx3="http://schemas.microsoft.com/office/drawing/2016/5/9/chartex" xmlns:cx4="http://schemas.microsoft.com/office/drawing/2016/5/10/chartex" xmlns:cx5="http://schemas.microsoft.com/office/drawing/2016/5/11/chartex" xmlns:cx6="http://schemas.microsoft.com/office/drawing/2016/5/12/chartex" xmlns:cx7="http://schemas.microsoft.com/office/drawing/2016/5/13/chartex" xmlns:cx8="http://schemas.microsoft.com/office/drawing/2016/5/14/chartex" xmlns:mc="http://schemas.openxmlformats.org/markup-compatibility/2006" xmlns:aink="http://schemas.microsoft.com/office/drawing/2016/ink" xmlns:am3d="http://schemas.microsoft.com/office/drawing/2017/model3d" xmlns:o="urn:schemas-microsoft-com:office:office" xmlns:r="http://schemas.openxmlformats.org/officeDocument/2006/relationships" xmlns:m="http://schemas.openxmlformats.org/officeDocument/2006/math" xmlns:v="urn:schemas-microsoft-com:vml" xmlns:wp14="http://schemas.microsoft.com/office/word/2010/wordprocessingDrawing" xmlns:wp="http://schemas.openxmlformats.org/drawingml/2006/wordprocessingDrawing" xmlns:w10="urn:schemas-microsoft-com:office:word" xmlns:w="http://schemas.openxmlformats.org/wordprocessingml/2006/main" xmlns:w14="http://schemas.microsoft.com/office/word/2010/wordml" xmlns:w15="http://schemas.microsoft.com/office/word/2012/wordml" xmlns:w16cid="http://schemas.microsoft.com/office/word/2016/wordml/cid" xmlns:w16se="http://schemas.microsoft.com/office/word/2015/wordml/symex" xmlns:wpg="http://schemas.microsoft.com/office/word/2010/wordprocessingGroup" xmlns:wpi="http://schemas.microsoft.com/office/word/2010/wordprocessingInk" xmlns:wne="http://schemas.microsoft.com/office/word/2006/wordml" xmlns:wps="http://schemas.microsoft.com/office/word/2010/wordprocessingShape" mc:Ignorable="w14 w15 w16se w16cid wp14">
   <w:footnote w:type="separator" w:id="-1">
     <w:p>
       <w:pPr>
@@ -2849,7 +3254,7 @@
 </file>
 
 <file path=word/header1.xml><?xml version="1.0" encoding="utf-8"?>
-<w:hdr xmlns:wpc="http://schemas.microsoft.com/office/word/2010/wordprocessingCanvas" xmlns:cx="http://schemas.microsoft.com/office/drawing/2014/chartex" xmlns:cx1="http://schemas.microsoft.com/office/drawing/2015/9/8/chartex" xmlns:cx2="http://schemas.microsoft.com/office/drawing/2015/10/21/chartex" xmlns:cx3="http://schemas.microsoft.com/office/drawing/2016/5/9/chartex" xmlns:cx4="http://schemas.microsoft.com/office/drawing/2016/5/10/chartex" xmlns:cx5="http://schemas.microsoft.com/office/drawing/2016/5/11/chartex" xmlns:cx6="http://schemas.microsoft.com/office/drawing/2016/5/12/chartex" xmlns:cx7="http://schemas.microsoft.com/office/drawing/2016/5/13/chartex" xmlns:cx8="http://schemas.microsoft.com/office/drawing/2016/5/14/chartex" xmlns:mc="http://schemas.openxmlformats.org/markup-compatibility/2006" xmlns:m="http://schemas.openxmlformats.org/officeDocument/2006/math" xmlns:aink="http://schemas.microsoft.com/office/drawing/2016/ink" xmlns:am3d="http://schemas.microsoft.com/office/drawing/2017/model3d" xmlns:oel="http://schemas.microsoft.com/office/2019/extlst" xmlns:r="http://schemas.openxmlformats.org/officeDocument/2006/relationships" xmlns:wp14="http://schemas.microsoft.com/office/word/2010/wordprocessingDrawing" xmlns:wp="http://schemas.openxmlformats.org/drawingml/2006/wordprocessingDrawing" xmlns:wpg="http://schemas.microsoft.com/office/word/2010/wordprocessingGroup" xmlns:wpi="http://schemas.microsoft.com/office/word/2010/wordprocessingInk" xmlns:wps="http://schemas.microsoft.com/office/word/2010/wordprocessingShape" xmlns:o="urn:schemas-microsoft-com:office:office" xmlns:v="urn:schemas-microsoft-com:vml" xmlns:w10="urn:schemas-microsoft-com:office:word" xmlns:w="http://schemas.openxmlformats.org/wordprocessingml/2006/main" xmlns:w14="http://schemas.microsoft.com/office/word/2010/wordml" xmlns:w15="http://schemas.microsoft.com/office/word/2012/wordml" xmlns:w16cex="http://schemas.microsoft.com/office/word/2018/wordml/cex" xmlns:w16cid="http://schemas.microsoft.com/office/word/2016/wordml/cid" xmlns:w16="http://schemas.microsoft.com/office/word/2018/wordml" xmlns:w16sdtdh="http://schemas.microsoft.com/office/word/2020/wordml/sdtdatahash" xmlns:w16sdtfl="http://schemas.microsoft.com/office/word/2024/wordml/sdtformatlock" xmlns:w16se="http://schemas.microsoft.com/office/word/2015/wordml/symex" xmlns:w16du="http://schemas.microsoft.com/office/word/2023/wordml/word16du" xmlns:wne="http://schemas.microsoft.com/office/word/2006/wordml" mc:Ignorable="w14 w15 w16se w16cid w16 w16cex w16sdtdh w16sdtfl w16du wp14">
+<w:hdr xmlns:wpc="http://schemas.microsoft.com/office/word/2010/wordprocessingCanvas" xmlns:cx="http://schemas.microsoft.com/office/drawing/2014/chartex" xmlns:cx1="http://schemas.microsoft.com/office/drawing/2015/9/8/chartex" xmlns:cx2="http://schemas.microsoft.com/office/drawing/2015/10/21/chartex" xmlns:cx3="http://schemas.microsoft.com/office/drawing/2016/5/9/chartex" xmlns:cx4="http://schemas.microsoft.com/office/drawing/2016/5/10/chartex" xmlns:cx5="http://schemas.microsoft.com/office/drawing/2016/5/11/chartex" xmlns:cx6="http://schemas.microsoft.com/office/drawing/2016/5/12/chartex" xmlns:cx7="http://schemas.microsoft.com/office/drawing/2016/5/13/chartex" xmlns:cx8="http://schemas.microsoft.com/office/drawing/2016/5/14/chartex" xmlns:mc="http://schemas.openxmlformats.org/markup-compatibility/2006" xmlns:aink="http://schemas.microsoft.com/office/drawing/2016/ink" xmlns:am3d="http://schemas.microsoft.com/office/drawing/2017/model3d" xmlns:o="urn:schemas-microsoft-com:office:office" xmlns:r="http://schemas.openxmlformats.org/officeDocument/2006/relationships" xmlns:m="http://schemas.openxmlformats.org/officeDocument/2006/math" xmlns:v="urn:schemas-microsoft-com:vml" xmlns:wp14="http://schemas.microsoft.com/office/word/2010/wordprocessingDrawing" xmlns:wp="http://schemas.openxmlformats.org/drawingml/2006/wordprocessingDrawing" xmlns:w10="urn:schemas-microsoft-com:office:word" xmlns:w="http://schemas.openxmlformats.org/wordprocessingml/2006/main" xmlns:w14="http://schemas.microsoft.com/office/word/2010/wordml" xmlns:w15="http://schemas.microsoft.com/office/word/2012/wordml" xmlns:w16cid="http://schemas.microsoft.com/office/word/2016/wordml/cid" xmlns:w16se="http://schemas.microsoft.com/office/word/2015/wordml/symex" xmlns:wpg="http://schemas.microsoft.com/office/word/2010/wordprocessingGroup" xmlns:wpi="http://schemas.microsoft.com/office/word/2010/wordprocessingInk" xmlns:wne="http://schemas.microsoft.com/office/word/2006/wordml" xmlns:wps="http://schemas.microsoft.com/office/word/2010/wordprocessingShape" mc:Ignorable="w14 w15 w16se w16cid wp14">
   <w:p>
     <w:pPr>
       <w:pBdr>
@@ -2908,14 +3313,21 @@
         <w:color w:val="1F4E79"/>
         <w:sz w:val="20"/>
       </w:rPr>
-      <w:t>Escuela Profesional de Ingeniería de Sistemas</w:t>
+      <w:t>Escuela Profesio</w:t>
+    </w:r>
+    <w:r>
+      <w:rPr>
+        <w:color w:val="1F4E79"/>
+        <w:sz w:val="20"/>
+      </w:rPr>
+      <w:t>nal de Ingeniería de Sistemas</w:t>
     </w:r>
   </w:p>
 </w:hdr>
 </file>
 
 <file path=word/numbering.xml><?xml version="1.0" encoding="utf-8"?>
-<w:numbering xmlns:wpc="http://schemas.microsoft.com/office/word/2010/wordprocessingCanvas" xmlns:cx="http://schemas.microsoft.com/office/drawing/2014/chartex" xmlns:cx1="http://schemas.microsoft.com/office/drawing/2015/9/8/chartex" xmlns:cx2="http://schemas.microsoft.com/office/drawing/2015/10/21/chartex" xmlns:cx3="http://schemas.microsoft.com/office/drawing/2016/5/9/chartex" xmlns:cx4="http://schemas.microsoft.com/office/drawing/2016/5/10/chartex" xmlns:cx5="http://schemas.microsoft.com/office/drawing/2016/5/11/chartex" xmlns:cx6="http://schemas.microsoft.com/office/drawing/2016/5/12/chartex" xmlns:cx7="http://schemas.microsoft.com/office/drawing/2016/5/13/chartex" xmlns:cx8="http://schemas.microsoft.com/office/drawing/2016/5/14/chartex" xmlns:mc="http://schemas.openxmlformats.org/markup-compatibility/2006" xmlns:m="http://schemas.openxmlformats.org/officeDocument/2006/math" xmlns:aink="http://schemas.microsoft.com/office/drawing/2016/ink" xmlns:am3d="http://schemas.microsoft.com/office/drawing/2017/model3d" xmlns:oel="http://schemas.microsoft.com/office/2019/extlst" xmlns:r="http://schemas.openxmlformats.org/officeDocument/2006/relationships" xmlns:wp14="http://schemas.microsoft.com/office/word/2010/wordprocessingDrawing" xmlns:wp="http://schemas.openxmlformats.org/drawingml/2006/wordprocessingDrawing" xmlns:wpg="http://schemas.microsoft.com/office/word/2010/wordprocessingGroup" xmlns:wpi="http://schemas.microsoft.com/office/word/2010/wordprocessingInk" xmlns:wps="http://schemas.microsoft.com/office/word/2010/wordprocessingShape" xmlns:o="urn:schemas-microsoft-com:office:office" xmlns:v="urn:schemas-microsoft-com:vml" xmlns:w10="urn:schemas-microsoft-com:office:word" xmlns:w="http://schemas.openxmlformats.org/wordprocessingml/2006/main" xmlns:w14="http://schemas.microsoft.com/office/word/2010/wordml" xmlns:w15="http://schemas.microsoft.com/office/word/2012/wordml" xmlns:w16cex="http://schemas.microsoft.com/office/word/2018/wordml/cex" xmlns:w16cid="http://schemas.microsoft.com/office/word/2016/wordml/cid" xmlns:w16="http://schemas.microsoft.com/office/word/2018/wordml" xmlns:w16sdtdh="http://schemas.microsoft.com/office/word/2020/wordml/sdtdatahash" xmlns:w16sdtfl="http://schemas.microsoft.com/office/word/2024/wordml/sdtformatlock" xmlns:w16se="http://schemas.microsoft.com/office/word/2015/wordml/symex" xmlns:w16du="http://schemas.microsoft.com/office/word/2023/wordml/word16du" xmlns:wne="http://schemas.microsoft.com/office/word/2006/wordml" mc:Ignorable="w14 w15 w16se w16cid w16 w16cex w16sdtdh w16sdtfl w16du wp14">
+<w:numbering xmlns:wpc="http://schemas.microsoft.com/office/word/2010/wordprocessingCanvas" xmlns:cx="http://schemas.microsoft.com/office/drawing/2014/chartex" xmlns:cx1="http://schemas.microsoft.com/office/drawing/2015/9/8/chartex" xmlns:cx2="http://schemas.microsoft.com/office/drawing/2015/10/21/chartex" xmlns:cx3="http://schemas.microsoft.com/office/drawing/2016/5/9/chartex" xmlns:cx4="http://schemas.microsoft.com/office/drawing/2016/5/10/chartex" xmlns:cx5="http://schemas.microsoft.com/office/drawing/2016/5/11/chartex" xmlns:cx6="http://schemas.microsoft.com/office/drawing/2016/5/12/chartex" xmlns:cx7="http://schemas.microsoft.com/office/drawing/2016/5/13/chartex" xmlns:cx8="http://schemas.microsoft.com/office/drawing/2016/5/14/chartex" xmlns:mc="http://schemas.openxmlformats.org/markup-compatibility/2006" xmlns:aink="http://schemas.microsoft.com/office/drawing/2016/ink" xmlns:am3d="http://schemas.microsoft.com/office/drawing/2017/model3d" xmlns:o="urn:schemas-microsoft-com:office:office" xmlns:r="http://schemas.openxmlformats.org/officeDocument/2006/relationships" xmlns:m="http://schemas.openxmlformats.org/officeDocument/2006/math" xmlns:v="urn:schemas-microsoft-com:vml" xmlns:wp14="http://schemas.microsoft.com/office/word/2010/wordprocessingDrawing" xmlns:wp="http://schemas.openxmlformats.org/drawingml/2006/wordprocessingDrawing" xmlns:w10="urn:schemas-microsoft-com:office:word" xmlns:w="http://schemas.openxmlformats.org/wordprocessingml/2006/main" xmlns:w14="http://schemas.microsoft.com/office/word/2010/wordml" xmlns:w15="http://schemas.microsoft.com/office/word/2012/wordml" xmlns:w16cid="http://schemas.microsoft.com/office/word/2016/wordml/cid" xmlns:w16se="http://schemas.microsoft.com/office/word/2015/wordml/symex" xmlns:wpg="http://schemas.microsoft.com/office/word/2010/wordprocessingGroup" xmlns:wpi="http://schemas.microsoft.com/office/word/2010/wordprocessingInk" xmlns:wne="http://schemas.microsoft.com/office/word/2006/wordml" xmlns:wps="http://schemas.microsoft.com/office/word/2010/wordprocessingShape" mc:Ignorable="w14 w15 w16se w16cid wp14">
   <w:abstractNum w:abstractNumId="0" w15:restartNumberingAfterBreak="0">
     <w:nsid w:val="0000A990"/>
     <w:multiLevelType w:val="multilevel"/>
@@ -3079,10 +3491,236 @@
       </w:pPr>
     </w:lvl>
   </w:abstractNum>
-  <w:num w:numId="1" w16cid:durableId="1891645682">
+  <w:abstractNum w:abstractNumId="2" w15:restartNumberingAfterBreak="0">
+    <w:nsid w:val="246E4FCA"/>
+    <w:multiLevelType w:val="hybridMultilevel"/>
+    <w:tmpl w:val="5F98D400"/>
+    <w:lvl w:ilvl="0" w:tplc="280A0001">
+      <w:start w:val="1"/>
+      <w:numFmt w:val="bullet"/>
+      <w:lvlText w:val=""/>
+      <w:lvlJc w:val="left"/>
+      <w:pPr>
+        <w:ind w:left="720" w:hanging="360"/>
+      </w:pPr>
+      <w:rPr>
+        <w:rFonts w:ascii="Symbol" w:hAnsi="Symbol" w:hint="default"/>
+      </w:rPr>
+    </w:lvl>
+    <w:lvl w:ilvl="1" w:tplc="280A0003" w:tentative="1">
+      <w:start w:val="1"/>
+      <w:numFmt w:val="bullet"/>
+      <w:lvlText w:val="o"/>
+      <w:lvlJc w:val="left"/>
+      <w:pPr>
+        <w:ind w:left="1440" w:hanging="360"/>
+      </w:pPr>
+      <w:rPr>
+        <w:rFonts w:ascii="Courier New" w:hAnsi="Courier New" w:cs="Courier New" w:hint="default"/>
+      </w:rPr>
+    </w:lvl>
+    <w:lvl w:ilvl="2" w:tplc="280A0005" w:tentative="1">
+      <w:start w:val="1"/>
+      <w:numFmt w:val="bullet"/>
+      <w:lvlText w:val=""/>
+      <w:lvlJc w:val="left"/>
+      <w:pPr>
+        <w:ind w:left="2160" w:hanging="360"/>
+      </w:pPr>
+      <w:rPr>
+        <w:rFonts w:ascii="Wingdings" w:hAnsi="Wingdings" w:hint="default"/>
+      </w:rPr>
+    </w:lvl>
+    <w:lvl w:ilvl="3" w:tplc="280A0001" w:tentative="1">
+      <w:start w:val="1"/>
+      <w:numFmt w:val="bullet"/>
+      <w:lvlText w:val=""/>
+      <w:lvlJc w:val="left"/>
+      <w:pPr>
+        <w:ind w:left="2880" w:hanging="360"/>
+      </w:pPr>
+      <w:rPr>
+        <w:rFonts w:ascii="Symbol" w:hAnsi="Symbol" w:hint="default"/>
+      </w:rPr>
+    </w:lvl>
+    <w:lvl w:ilvl="4" w:tplc="280A0003" w:tentative="1">
+      <w:start w:val="1"/>
+      <w:numFmt w:val="bullet"/>
+      <w:lvlText w:val="o"/>
+      <w:lvlJc w:val="left"/>
+      <w:pPr>
+        <w:ind w:left="3600" w:hanging="360"/>
+      </w:pPr>
+      <w:rPr>
+        <w:rFonts w:ascii="Courier New" w:hAnsi="Courier New" w:cs="Courier New" w:hint="default"/>
+      </w:rPr>
+    </w:lvl>
+    <w:lvl w:ilvl="5" w:tplc="280A0005" w:tentative="1">
+      <w:start w:val="1"/>
+      <w:numFmt w:val="bullet"/>
+      <w:lvlText w:val=""/>
+      <w:lvlJc w:val="left"/>
+      <w:pPr>
+        <w:ind w:left="4320" w:hanging="360"/>
+      </w:pPr>
+      <w:rPr>
+        <w:rFonts w:ascii="Wingdings" w:hAnsi="Wingdings" w:hint="default"/>
+      </w:rPr>
+    </w:lvl>
+    <w:lvl w:ilvl="6" w:tplc="280A0001" w:tentative="1">
+      <w:start w:val="1"/>
+      <w:numFmt w:val="bullet"/>
+      <w:lvlText w:val=""/>
+      <w:lvlJc w:val="left"/>
+      <w:pPr>
+        <w:ind w:left="5040" w:hanging="360"/>
+      </w:pPr>
+      <w:rPr>
+        <w:rFonts w:ascii="Symbol" w:hAnsi="Symbol" w:hint="default"/>
+      </w:rPr>
+    </w:lvl>
+    <w:lvl w:ilvl="7" w:tplc="280A0003" w:tentative="1">
+      <w:start w:val="1"/>
+      <w:numFmt w:val="bullet"/>
+      <w:lvlText w:val="o"/>
+      <w:lvlJc w:val="left"/>
+      <w:pPr>
+        <w:ind w:left="5760" w:hanging="360"/>
+      </w:pPr>
+      <w:rPr>
+        <w:rFonts w:ascii="Courier New" w:hAnsi="Courier New" w:cs="Courier New" w:hint="default"/>
+      </w:rPr>
+    </w:lvl>
+    <w:lvl w:ilvl="8" w:tplc="280A0005" w:tentative="1">
+      <w:start w:val="1"/>
+      <w:numFmt w:val="bullet"/>
+      <w:lvlText w:val=""/>
+      <w:lvlJc w:val="left"/>
+      <w:pPr>
+        <w:ind w:left="6480" w:hanging="360"/>
+      </w:pPr>
+      <w:rPr>
+        <w:rFonts w:ascii="Wingdings" w:hAnsi="Wingdings" w:hint="default"/>
+      </w:rPr>
+    </w:lvl>
+  </w:abstractNum>
+  <w:abstractNum w:abstractNumId="3" w15:restartNumberingAfterBreak="0">
+    <w:nsid w:val="307C535C"/>
+    <w:multiLevelType w:val="hybridMultilevel"/>
+    <w:tmpl w:val="726AB7D2"/>
+    <w:lvl w:ilvl="0" w:tplc="280A0001">
+      <w:start w:val="1"/>
+      <w:numFmt w:val="bullet"/>
+      <w:lvlText w:val=""/>
+      <w:lvlJc w:val="left"/>
+      <w:pPr>
+        <w:ind w:left="720" w:hanging="360"/>
+      </w:pPr>
+      <w:rPr>
+        <w:rFonts w:ascii="Symbol" w:hAnsi="Symbol" w:hint="default"/>
+      </w:rPr>
+    </w:lvl>
+    <w:lvl w:ilvl="1" w:tplc="280A0003" w:tentative="1">
+      <w:start w:val="1"/>
+      <w:numFmt w:val="bullet"/>
+      <w:lvlText w:val="o"/>
+      <w:lvlJc w:val="left"/>
+      <w:pPr>
+        <w:ind w:left="1440" w:hanging="360"/>
+      </w:pPr>
+      <w:rPr>
+        <w:rFonts w:ascii="Courier New" w:hAnsi="Courier New" w:cs="Courier New" w:hint="default"/>
+      </w:rPr>
+    </w:lvl>
+    <w:lvl w:ilvl="2" w:tplc="280A0005" w:tentative="1">
+      <w:start w:val="1"/>
+      <w:numFmt w:val="bullet"/>
+      <w:lvlText w:val=""/>
+      <w:lvlJc w:val="left"/>
+      <w:pPr>
+        <w:ind w:left="2160" w:hanging="360"/>
+      </w:pPr>
+      <w:rPr>
+        <w:rFonts w:ascii="Wingdings" w:hAnsi="Wingdings" w:hint="default"/>
+      </w:rPr>
+    </w:lvl>
+    <w:lvl w:ilvl="3" w:tplc="280A0001" w:tentative="1">
+      <w:start w:val="1"/>
+      <w:numFmt w:val="bullet"/>
+      <w:lvlText w:val=""/>
+      <w:lvlJc w:val="left"/>
+      <w:pPr>
+        <w:ind w:left="2880" w:hanging="360"/>
+      </w:pPr>
+      <w:rPr>
+        <w:rFonts w:ascii="Symbol" w:hAnsi="Symbol" w:hint="default"/>
+      </w:rPr>
+    </w:lvl>
+    <w:lvl w:ilvl="4" w:tplc="280A0003" w:tentative="1">
+      <w:start w:val="1"/>
+      <w:numFmt w:val="bullet"/>
+      <w:lvlText w:val="o"/>
+      <w:lvlJc w:val="left"/>
+      <w:pPr>
+        <w:ind w:left="3600" w:hanging="360"/>
+      </w:pPr>
+      <w:rPr>
+        <w:rFonts w:ascii="Courier New" w:hAnsi="Courier New" w:cs="Courier New" w:hint="default"/>
+      </w:rPr>
+    </w:lvl>
+    <w:lvl w:ilvl="5" w:tplc="280A0005" w:tentative="1">
+      <w:start w:val="1"/>
+      <w:numFmt w:val="bullet"/>
+      <w:lvlText w:val=""/>
+      <w:lvlJc w:val="left"/>
+      <w:pPr>
+        <w:ind w:left="4320" w:hanging="360"/>
+      </w:pPr>
+      <w:rPr>
+        <w:rFonts w:ascii="Wingdings" w:hAnsi="Wingdings" w:hint="default"/>
+      </w:rPr>
+    </w:lvl>
+    <w:lvl w:ilvl="6" w:tplc="280A0001" w:tentative="1">
+      <w:start w:val="1"/>
+      <w:numFmt w:val="bullet"/>
+      <w:lvlText w:val=""/>
+      <w:lvlJc w:val="left"/>
+      <w:pPr>
+        <w:ind w:left="5040" w:hanging="360"/>
+      </w:pPr>
+      <w:rPr>
+        <w:rFonts w:ascii="Symbol" w:hAnsi="Symbol" w:hint="default"/>
+      </w:rPr>
+    </w:lvl>
+    <w:lvl w:ilvl="7" w:tplc="280A0003" w:tentative="1">
+      <w:start w:val="1"/>
+      <w:numFmt w:val="bullet"/>
+      <w:lvlText w:val="o"/>
+      <w:lvlJc w:val="left"/>
+      <w:pPr>
+        <w:ind w:left="5760" w:hanging="360"/>
+      </w:pPr>
+      <w:rPr>
+        <w:rFonts w:ascii="Courier New" w:hAnsi="Courier New" w:cs="Courier New" w:hint="default"/>
+      </w:rPr>
+    </w:lvl>
+    <w:lvl w:ilvl="8" w:tplc="280A0005" w:tentative="1">
+      <w:start w:val="1"/>
+      <w:numFmt w:val="bullet"/>
+      <w:lvlText w:val=""/>
+      <w:lvlJc w:val="left"/>
+      <w:pPr>
+        <w:ind w:left="6480" w:hanging="360"/>
+      </w:pPr>
+      <w:rPr>
+        <w:rFonts w:ascii="Wingdings" w:hAnsi="Wingdings" w:hint="default"/>
+      </w:rPr>
+    </w:lvl>
+  </w:abstractNum>
+  <w:num w:numId="1">
     <w:abstractNumId w:val="0"/>
   </w:num>
-  <w:num w:numId="2" w16cid:durableId="1039672204">
+  <w:num w:numId="2">
     <w:abstractNumId w:val="1"/>
     <w:lvlOverride w:ilvl="0">
       <w:startOverride w:val="1"/>
@@ -3112,7 +3750,7 @@
       <w:startOverride w:val="1"/>
     </w:lvlOverride>
   </w:num>
-  <w:num w:numId="3" w16cid:durableId="386606032">
+  <w:num w:numId="3">
     <w:abstractNumId w:val="1"/>
     <w:lvlOverride w:ilvl="0">
       <w:startOverride w:val="1"/>
@@ -3142,18 +3780,24 @@
       <w:startOverride w:val="1"/>
     </w:lvlOverride>
   </w:num>
+  <w:num w:numId="4">
+    <w:abstractNumId w:val="2"/>
+  </w:num>
+  <w:num w:numId="5">
+    <w:abstractNumId w:val="3"/>
+  </w:num>
 </w:numbering>
 </file>
 
 <file path=word/styles.xml><?xml version="1.0" encoding="utf-8"?>
-<w:styles xmlns:mc="http://schemas.openxmlformats.org/markup-compatibility/2006" xmlns:r="http://schemas.openxmlformats.org/officeDocument/2006/relationships" xmlns:w="http://schemas.openxmlformats.org/wordprocessingml/2006/main" xmlns:w14="http://schemas.microsoft.com/office/word/2010/wordml" xmlns:w15="http://schemas.microsoft.com/office/word/2012/wordml" xmlns:w16cex="http://schemas.microsoft.com/office/word/2018/wordml/cex" xmlns:w16cid="http://schemas.microsoft.com/office/word/2016/wordml/cid" xmlns:w16="http://schemas.microsoft.com/office/word/2018/wordml" xmlns:w16sdtdh="http://schemas.microsoft.com/office/word/2020/wordml/sdtdatahash" xmlns:w16sdtfl="http://schemas.microsoft.com/office/word/2024/wordml/sdtformatlock" xmlns:w16se="http://schemas.microsoft.com/office/word/2015/wordml/symex" xmlns:w16du="http://schemas.microsoft.com/office/word/2023/wordml/word16du" mc:Ignorable="w14 w15 w16se w16cid w16 w16cex w16sdtdh w16sdtfl w16du">
+<w:styles xmlns:mc="http://schemas.openxmlformats.org/markup-compatibility/2006" xmlns:r="http://schemas.openxmlformats.org/officeDocument/2006/relationships" xmlns:w="http://schemas.openxmlformats.org/wordprocessingml/2006/main" xmlns:w14="http://schemas.microsoft.com/office/word/2010/wordml" xmlns:w15="http://schemas.microsoft.com/office/word/2012/wordml" xmlns:w16cid="http://schemas.microsoft.com/office/word/2016/wordml/cid" xmlns:w16se="http://schemas.microsoft.com/office/word/2015/wordml/symex" mc:Ignorable="w14 w15 w16se w16cid">
   <w:docDefaults>
     <w:rPrDefault>
       <w:rPr>
         <w:rFonts w:ascii="Arial" w:eastAsia="Arial" w:hAnsi="Arial" w:cs="Arial"/>
         <w:sz w:val="22"/>
         <w:szCs w:val="22"/>
-        <w:lang w:val="en-PE" w:eastAsia="en-US" w:bidi="ar-SA"/>
+        <w:lang w:eastAsia="en-US" w:bidi="ar-SA"/>
       </w:rPr>
     </w:rPrDefault>
     <w:pPrDefault>
@@ -3162,10 +3806,13 @@
       </w:pPr>
     </w:pPrDefault>
   </w:docDefaults>
-  <w:latentStyles w:defLockedState="0" w:defUIPriority="0" w:defSemiHidden="0" w:defUnhideWhenUsed="0" w:defQFormat="0" w:count="376">
+  <w:latentStyles w:defLockedState="0" w:defUIPriority="0" w:defSemiHidden="0" w:defUnhideWhenUsed="0" w:defQFormat="0" w:count="375">
+    <w:lsdException w:name="heading 2" w:uiPriority="9" w:qFormat="1"/>
     <w:lsdException w:name="toc 1" w:uiPriority="39"/>
     <w:lsdException w:name="toc 2" w:uiPriority="39"/>
     <w:lsdException w:name="Hyperlink" w:uiPriority="99"/>
+    <w:lsdException w:name="Strong" w:uiPriority="22" w:qFormat="1"/>
+    <w:lsdException w:name="Emphasis" w:uiPriority="20" w:qFormat="1"/>
     <w:lsdException w:name="Normal Table" w:semiHidden="1" w:unhideWhenUsed="1"/>
     <w:lsdException w:name="Table Simple 1" w:semiHidden="1" w:unhideWhenUsed="1"/>
     <w:lsdException w:name="Table Simple 2" w:semiHidden="1" w:unhideWhenUsed="1"/>
@@ -3407,17 +4054,16 @@
     <w:lsdException w:name="Smart Hyperlink" w:semiHidden="1" w:uiPriority="99" w:unhideWhenUsed="1"/>
     <w:lsdException w:name="Hashtag" w:semiHidden="1" w:uiPriority="99" w:unhideWhenUsed="1"/>
     <w:lsdException w:name="Unresolved Mention" w:semiHidden="1" w:uiPriority="99" w:unhideWhenUsed="1"/>
-    <w:lsdException w:name="Smart Link" w:semiHidden="1" w:uiPriority="99" w:unhideWhenUsed="1"/>
   </w:latentStyles>
   <w:style w:type="paragraph" w:default="1" w:styleId="Normal">
     <w:name w:val="Normal"/>
     <w:qFormat/>
   </w:style>
-  <w:style w:type="paragraph" w:styleId="Heading1">
+  <w:style w:type="paragraph" w:styleId="Ttulo1">
     <w:name w:val="heading 1"/>
     <w:basedOn w:val="Normal"/>
-    <w:next w:val="BodyText"/>
-    <w:link w:val="Heading1Char"/>
+    <w:next w:val="Textoindependiente"/>
+    <w:link w:val="Ttulo1Car"/>
     <w:uiPriority w:val="9"/>
     <w:qFormat/>
     <w:rsid w:val="00A10FD9"/>
@@ -3434,13 +4080,12 @@
       <w:szCs w:val="28"/>
     </w:rPr>
   </w:style>
-  <w:style w:type="paragraph" w:styleId="Heading2">
+  <w:style w:type="paragraph" w:styleId="Ttulo2">
     <w:name w:val="heading 2"/>
     <w:basedOn w:val="Normal"/>
-    <w:next w:val="BodyText"/>
-    <w:link w:val="Heading2Char"/>
+    <w:next w:val="Textoindependiente"/>
+    <w:link w:val="Ttulo2Car"/>
     <w:uiPriority w:val="9"/>
-    <w:semiHidden/>
     <w:unhideWhenUsed/>
     <w:qFormat/>
     <w:rsid w:val="00A10FD9"/>
@@ -3457,11 +4102,11 @@
       <w:szCs w:val="24"/>
     </w:rPr>
   </w:style>
-  <w:style w:type="paragraph" w:styleId="Heading3">
+  <w:style w:type="paragraph" w:styleId="Ttulo3">
     <w:name w:val="heading 3"/>
     <w:basedOn w:val="Normal"/>
-    <w:next w:val="BodyText"/>
-    <w:link w:val="Heading3Char"/>
+    <w:next w:val="Textoindependiente"/>
+    <w:link w:val="Ttulo3Car"/>
     <w:uiPriority w:val="9"/>
     <w:semiHidden/>
     <w:unhideWhenUsed/>
@@ -3478,11 +4123,11 @@
       <w:color w:val="1F4E79"/>
     </w:rPr>
   </w:style>
-  <w:style w:type="paragraph" w:styleId="Heading4">
+  <w:style w:type="paragraph" w:styleId="Ttulo4">
     <w:name w:val="heading 4"/>
     <w:basedOn w:val="Normal"/>
-    <w:next w:val="BodyText"/>
-    <w:link w:val="Heading4Char"/>
+    <w:next w:val="Textoindependiente"/>
+    <w:link w:val="Ttulo4Car"/>
     <w:uiPriority w:val="9"/>
     <w:semiHidden/>
     <w:unhideWhenUsed/>
@@ -3499,11 +4144,11 @@
       <w:color w:val="1F4E79"/>
     </w:rPr>
   </w:style>
-  <w:style w:type="paragraph" w:styleId="Heading5">
+  <w:style w:type="paragraph" w:styleId="Ttulo5">
     <w:name w:val="heading 5"/>
     <w:basedOn w:val="Normal"/>
-    <w:next w:val="BodyText"/>
-    <w:link w:val="Heading5Char"/>
+    <w:next w:val="Textoindependiente"/>
+    <w:link w:val="Ttulo5Car"/>
     <w:uiPriority w:val="9"/>
     <w:semiHidden/>
     <w:unhideWhenUsed/>
@@ -3519,11 +4164,11 @@
       <w:color w:val="0F4761" w:themeColor="accent1" w:themeShade="BF"/>
     </w:rPr>
   </w:style>
-  <w:style w:type="paragraph" w:styleId="Heading6">
+  <w:style w:type="paragraph" w:styleId="Ttulo6">
     <w:name w:val="heading 6"/>
     <w:basedOn w:val="Normal"/>
-    <w:next w:val="BodyText"/>
-    <w:link w:val="Heading6Char"/>
+    <w:next w:val="Textoindependiente"/>
+    <w:link w:val="Ttulo6Car"/>
     <w:uiPriority w:val="9"/>
     <w:semiHidden/>
     <w:unhideWhenUsed/>
@@ -3541,11 +4186,11 @@
       <w:color w:val="595959" w:themeColor="text1" w:themeTint="A6"/>
     </w:rPr>
   </w:style>
-  <w:style w:type="paragraph" w:styleId="Heading7">
+  <w:style w:type="paragraph" w:styleId="Ttulo7">
     <w:name w:val="heading 7"/>
     <w:basedOn w:val="Normal"/>
-    <w:next w:val="BodyText"/>
-    <w:link w:val="Heading7Char"/>
+    <w:next w:val="Textoindependiente"/>
+    <w:link w:val="Ttulo7Car"/>
     <w:uiPriority w:val="9"/>
     <w:semiHidden/>
     <w:unhideWhenUsed/>
@@ -3561,11 +4206,11 @@
       <w:color w:val="595959" w:themeColor="text1" w:themeTint="A6"/>
     </w:rPr>
   </w:style>
-  <w:style w:type="paragraph" w:styleId="Heading8">
+  <w:style w:type="paragraph" w:styleId="Ttulo8">
     <w:name w:val="heading 8"/>
     <w:basedOn w:val="Normal"/>
-    <w:next w:val="BodyText"/>
-    <w:link w:val="Heading8Char"/>
+    <w:next w:val="Textoindependiente"/>
+    <w:link w:val="Ttulo8Car"/>
     <w:uiPriority w:val="9"/>
     <w:semiHidden/>
     <w:unhideWhenUsed/>
@@ -3583,11 +4228,11 @@
       <w:color w:val="272727" w:themeColor="text1" w:themeTint="D8"/>
     </w:rPr>
   </w:style>
-  <w:style w:type="paragraph" w:styleId="Heading9">
+  <w:style w:type="paragraph" w:styleId="Ttulo9">
     <w:name w:val="heading 9"/>
     <w:basedOn w:val="Normal"/>
-    <w:next w:val="BodyText"/>
-    <w:link w:val="Heading9Char"/>
+    <w:next w:val="Textoindependiente"/>
+    <w:link w:val="Ttulo9Car"/>
     <w:uiPriority w:val="9"/>
     <w:semiHidden/>
     <w:unhideWhenUsed/>
@@ -3603,13 +4248,13 @@
       <w:color w:val="272727" w:themeColor="text1" w:themeTint="D8"/>
     </w:rPr>
   </w:style>
-  <w:style w:type="character" w:default="1" w:styleId="DefaultParagraphFont">
+  <w:style w:type="character" w:default="1" w:styleId="Fuentedeprrafopredeter">
     <w:name w:val="Default Paragraph Font"/>
     <w:uiPriority w:val="1"/>
     <w:semiHidden/>
     <w:unhideWhenUsed/>
   </w:style>
-  <w:style w:type="table" w:default="1" w:styleId="TableNormal">
+  <w:style w:type="table" w:default="1" w:styleId="Tablanormal">
     <w:name w:val="Normal Table"/>
     <w:uiPriority w:val="99"/>
     <w:semiHidden/>
@@ -3624,13 +4269,13 @@
       </w:tblCellMar>
     </w:tblPr>
   </w:style>
-  <w:style w:type="numbering" w:default="1" w:styleId="NoList">
+  <w:style w:type="numbering" w:default="1" w:styleId="Sinlista">
     <w:name w:val="No List"/>
     <w:uiPriority w:val="99"/>
     <w:semiHidden/>
     <w:unhideWhenUsed/>
   </w:style>
-  <w:style w:type="paragraph" w:styleId="BodyText">
+  <w:style w:type="paragraph" w:styleId="Textoindependiente">
     <w:name w:val="Body Text"/>
     <w:basedOn w:val="Normal"/>
     <w:qFormat/>
@@ -3641,23 +4286,23 @@
   </w:style>
   <w:style w:type="paragraph" w:customStyle="1" w:styleId="FirstParagraph">
     <w:name w:val="First Paragraph"/>
-    <w:basedOn w:val="BodyText"/>
-    <w:next w:val="BodyText"/>
+    <w:basedOn w:val="Textoindependiente"/>
+    <w:next w:val="Textoindependiente"/>
     <w:qFormat/>
   </w:style>
   <w:style w:type="paragraph" w:customStyle="1" w:styleId="Compact">
     <w:name w:val="Compact"/>
-    <w:basedOn w:val="BodyText"/>
+    <w:basedOn w:val="Textoindependiente"/>
     <w:qFormat/>
     <w:pPr>
       <w:spacing w:after="40"/>
     </w:pPr>
   </w:style>
-  <w:style w:type="paragraph" w:styleId="Title">
+  <w:style w:type="paragraph" w:styleId="Ttulo">
     <w:name w:val="Title"/>
     <w:basedOn w:val="Normal"/>
-    <w:next w:val="BodyText"/>
-    <w:link w:val="TitleChar"/>
+    <w:next w:val="Textoindependiente"/>
+    <w:link w:val="TtuloCar"/>
     <w:uiPriority w:val="10"/>
     <w:qFormat/>
     <w:rsid w:val="00A10FD9"/>
@@ -3671,10 +4316,10 @@
       <w:szCs w:val="56"/>
     </w:rPr>
   </w:style>
-  <w:style w:type="character" w:customStyle="1" w:styleId="TitleChar">
-    <w:name w:val="Title Char"/>
-    <w:basedOn w:val="DefaultParagraphFont"/>
-    <w:link w:val="Title"/>
+  <w:style w:type="character" w:customStyle="1" w:styleId="TtuloCar">
+    <w:name w:val="Título Car"/>
+    <w:basedOn w:val="Fuentedeprrafopredeter"/>
+    <w:link w:val="Ttulo"/>
     <w:uiPriority w:val="10"/>
     <w:rsid w:val="00A10FD9"/>
     <w:rPr>
@@ -3683,11 +4328,11 @@
       <w:szCs w:val="56"/>
     </w:rPr>
   </w:style>
-  <w:style w:type="paragraph" w:styleId="Subtitle">
+  <w:style w:type="paragraph" w:styleId="Subttulo">
     <w:name w:val="Subtitle"/>
-    <w:basedOn w:val="Title"/>
-    <w:next w:val="BodyText"/>
-    <w:link w:val="SubtitleChar"/>
+    <w:basedOn w:val="Ttulo"/>
+    <w:next w:val="Textoindependiente"/>
+    <w:link w:val="SubttuloCar"/>
     <w:uiPriority w:val="11"/>
     <w:qFormat/>
     <w:rsid w:val="00A10FD9"/>
@@ -3702,10 +4347,10 @@
       <w:szCs w:val="28"/>
     </w:rPr>
   </w:style>
-  <w:style w:type="character" w:customStyle="1" w:styleId="SubtitleChar">
-    <w:name w:val="Subtitle Char"/>
-    <w:basedOn w:val="DefaultParagraphFont"/>
-    <w:link w:val="Subtitle"/>
+  <w:style w:type="character" w:customStyle="1" w:styleId="SubttuloCar">
+    <w:name w:val="Subtítulo Car"/>
+    <w:basedOn w:val="Fuentedeprrafopredeter"/>
+    <w:link w:val="Subttulo"/>
     <w:uiPriority w:val="11"/>
     <w:rsid w:val="00A10FD9"/>
     <w:rPr>
@@ -3718,8 +4363,8 @@
   </w:style>
   <w:style w:type="paragraph" w:customStyle="1" w:styleId="Author">
     <w:name w:val="Author"/>
-    <w:basedOn w:val="Title"/>
-    <w:next w:val="BodyText"/>
+    <w:basedOn w:val="Ttulo"/>
+    <w:next w:val="Textoindependiente"/>
     <w:qFormat/>
     <w:pPr>
       <w:keepNext/>
@@ -3730,10 +4375,10 @@
       <w:szCs w:val="24"/>
     </w:rPr>
   </w:style>
-  <w:style w:type="paragraph" w:styleId="Date">
+  <w:style w:type="paragraph" w:styleId="Fecha">
     <w:name w:val="Date"/>
-    <w:basedOn w:val="Title"/>
-    <w:next w:val="BodyText"/>
+    <w:basedOn w:val="Ttulo"/>
+    <w:next w:val="Textoindependiente"/>
     <w:qFormat/>
     <w:pPr>
       <w:keepNext/>
@@ -3764,7 +4409,7 @@
   <w:style w:type="paragraph" w:customStyle="1" w:styleId="Abstract">
     <w:name w:val="Abstract"/>
     <w:basedOn w:val="Normal"/>
-    <w:next w:val="BodyText"/>
+    <w:next w:val="Textoindependiente"/>
     <w:qFormat/>
     <w:pPr>
       <w:keepNext/>
@@ -3776,15 +4421,15 @@
       <w:szCs w:val="20"/>
     </w:rPr>
   </w:style>
-  <w:style w:type="paragraph" w:styleId="Bibliography">
+  <w:style w:type="paragraph" w:styleId="Bibliografa">
     <w:name w:val="Bibliography"/>
     <w:basedOn w:val="Normal"/>
     <w:qFormat/>
   </w:style>
-  <w:style w:type="character" w:customStyle="1" w:styleId="Heading1Char">
-    <w:name w:val="Heading 1 Char"/>
-    <w:basedOn w:val="DefaultParagraphFont"/>
-    <w:link w:val="Heading1"/>
+  <w:style w:type="character" w:customStyle="1" w:styleId="Ttulo1Car">
+    <w:name w:val="Título 1 Car"/>
+    <w:basedOn w:val="Fuentedeprrafopredeter"/>
+    <w:link w:val="Ttulo1"/>
     <w:uiPriority w:val="9"/>
     <w:rsid w:val="00A10FD9"/>
     <w:rPr>
@@ -3794,12 +4439,11 @@
       <w:szCs w:val="40"/>
     </w:rPr>
   </w:style>
-  <w:style w:type="character" w:customStyle="1" w:styleId="Heading2Char">
-    <w:name w:val="Heading 2 Char"/>
-    <w:basedOn w:val="DefaultParagraphFont"/>
-    <w:link w:val="Heading2"/>
+  <w:style w:type="character" w:customStyle="1" w:styleId="Ttulo2Car">
+    <w:name w:val="Título 2 Car"/>
+    <w:basedOn w:val="Fuentedeprrafopredeter"/>
+    <w:link w:val="Ttulo2"/>
     <w:uiPriority w:val="9"/>
-    <w:semiHidden/>
     <w:rsid w:val="00A10FD9"/>
     <w:rPr>
       <w:rFonts w:ascii="Arial" w:eastAsia="Arial" w:hAnsi="Arial" w:cs="Arial"/>
@@ -3808,10 +4452,10 @@
       <w:szCs w:val="32"/>
     </w:rPr>
   </w:style>
-  <w:style w:type="character" w:customStyle="1" w:styleId="Heading3Char">
-    <w:name w:val="Heading 3 Char"/>
-    <w:basedOn w:val="DefaultParagraphFont"/>
-    <w:link w:val="Heading3"/>
+  <w:style w:type="character" w:customStyle="1" w:styleId="Ttulo3Car">
+    <w:name w:val="Título 3 Car"/>
+    <w:basedOn w:val="Fuentedeprrafopredeter"/>
+    <w:link w:val="Ttulo3"/>
     <w:uiPriority w:val="9"/>
     <w:semiHidden/>
     <w:rsid w:val="00A10FD9"/>
@@ -3822,10 +4466,10 @@
       <w:szCs w:val="28"/>
     </w:rPr>
   </w:style>
-  <w:style w:type="character" w:customStyle="1" w:styleId="Heading4Char">
-    <w:name w:val="Heading 4 Char"/>
-    <w:basedOn w:val="DefaultParagraphFont"/>
-    <w:link w:val="Heading4"/>
+  <w:style w:type="character" w:customStyle="1" w:styleId="Ttulo4Car">
+    <w:name w:val="Título 4 Car"/>
+    <w:basedOn w:val="Fuentedeprrafopredeter"/>
+    <w:link w:val="Ttulo4"/>
     <w:uiPriority w:val="9"/>
     <w:semiHidden/>
     <w:rsid w:val="00A10FD9"/>
@@ -3836,10 +4480,10 @@
       <w:color w:val="0F4761" w:themeColor="accent1" w:themeShade="BF"/>
     </w:rPr>
   </w:style>
-  <w:style w:type="character" w:customStyle="1" w:styleId="Heading5Char">
-    <w:name w:val="Heading 5 Char"/>
-    <w:basedOn w:val="DefaultParagraphFont"/>
-    <w:link w:val="Heading5"/>
+  <w:style w:type="character" w:customStyle="1" w:styleId="Ttulo5Car">
+    <w:name w:val="Título 5 Car"/>
+    <w:basedOn w:val="Fuentedeprrafopredeter"/>
+    <w:link w:val="Ttulo5"/>
     <w:uiPriority w:val="9"/>
     <w:semiHidden/>
     <w:rsid w:val="00A10FD9"/>
@@ -3848,10 +4492,10 @@
       <w:color w:val="0F4761" w:themeColor="accent1" w:themeShade="BF"/>
     </w:rPr>
   </w:style>
-  <w:style w:type="character" w:customStyle="1" w:styleId="Heading6Char">
-    <w:name w:val="Heading 6 Char"/>
-    <w:basedOn w:val="DefaultParagraphFont"/>
-    <w:link w:val="Heading6"/>
+  <w:style w:type="character" w:customStyle="1" w:styleId="Ttulo6Car">
+    <w:name w:val="Título 6 Car"/>
+    <w:basedOn w:val="Fuentedeprrafopredeter"/>
+    <w:link w:val="Ttulo6"/>
     <w:uiPriority w:val="9"/>
     <w:semiHidden/>
     <w:rsid w:val="00A10FD9"/>
@@ -3862,10 +4506,10 @@
       <w:color w:val="595959" w:themeColor="text1" w:themeTint="A6"/>
     </w:rPr>
   </w:style>
-  <w:style w:type="character" w:customStyle="1" w:styleId="Heading7Char">
-    <w:name w:val="Heading 7 Char"/>
-    <w:basedOn w:val="DefaultParagraphFont"/>
-    <w:link w:val="Heading7"/>
+  <w:style w:type="character" w:customStyle="1" w:styleId="Ttulo7Car">
+    <w:name w:val="Título 7 Car"/>
+    <w:basedOn w:val="Fuentedeprrafopredeter"/>
+    <w:link w:val="Ttulo7"/>
     <w:uiPriority w:val="9"/>
     <w:semiHidden/>
     <w:rsid w:val="00A10FD9"/>
@@ -3874,10 +4518,10 @@
       <w:color w:val="595959" w:themeColor="text1" w:themeTint="A6"/>
     </w:rPr>
   </w:style>
-  <w:style w:type="character" w:customStyle="1" w:styleId="Heading8Char">
-    <w:name w:val="Heading 8 Char"/>
-    <w:basedOn w:val="DefaultParagraphFont"/>
-    <w:link w:val="Heading8"/>
+  <w:style w:type="character" w:customStyle="1" w:styleId="Ttulo8Car">
+    <w:name w:val="Título 8 Car"/>
+    <w:basedOn w:val="Fuentedeprrafopredeter"/>
+    <w:link w:val="Ttulo8"/>
     <w:uiPriority w:val="9"/>
     <w:semiHidden/>
     <w:rsid w:val="00A10FD9"/>
@@ -3888,10 +4532,10 @@
       <w:color w:val="272727" w:themeColor="text1" w:themeTint="D8"/>
     </w:rPr>
   </w:style>
-  <w:style w:type="character" w:customStyle="1" w:styleId="Heading9Char">
-    <w:name w:val="Heading 9 Char"/>
-    <w:basedOn w:val="DefaultParagraphFont"/>
-    <w:link w:val="Heading9"/>
+  <w:style w:type="character" w:customStyle="1" w:styleId="Ttulo9Car">
+    <w:name w:val="Título 9 Car"/>
+    <w:basedOn w:val="Fuentedeprrafopredeter"/>
+    <w:link w:val="Ttulo9"/>
     <w:uiPriority w:val="9"/>
     <w:semiHidden/>
     <w:rsid w:val="00A10FD9"/>
@@ -3900,10 +4544,10 @@
       <w:color w:val="272727" w:themeColor="text1" w:themeTint="D8"/>
     </w:rPr>
   </w:style>
-  <w:style w:type="paragraph" w:styleId="BlockText">
+  <w:style w:type="paragraph" w:styleId="Textodebloque">
     <w:name w:val="Block Text"/>
-    <w:basedOn w:val="BodyText"/>
-    <w:next w:val="BodyText"/>
+    <w:basedOn w:val="Textoindependiente"/>
+    <w:next w:val="Textoindependiente"/>
     <w:uiPriority w:val="9"/>
     <w:unhideWhenUsed/>
     <w:qFormat/>
@@ -3912,7 +4556,7 @@
       <w:ind w:left="480" w:right="480"/>
     </w:pPr>
   </w:style>
-  <w:style w:type="paragraph" w:styleId="FootnoteText">
+  <w:style w:type="paragraph" w:styleId="Textonotapie">
     <w:name w:val="footnote text"/>
     <w:basedOn w:val="Normal"/>
     <w:uiPriority w:val="9"/>
@@ -3921,8 +4565,8 @@
   </w:style>
   <w:style w:type="paragraph" w:customStyle="1" w:styleId="FootnoteBlockText">
     <w:name w:val="Footnote Block Text"/>
-    <w:basedOn w:val="FootnoteText"/>
-    <w:next w:val="FootnoteText"/>
+    <w:basedOn w:val="Textonotapie"/>
+    <w:next w:val="Textonotapie"/>
     <w:uiPriority w:val="9"/>
     <w:unhideWhenUsed/>
     <w:qFormat/>
@@ -3981,10 +4625,10 @@
     <w:name w:val="Definition"/>
     <w:basedOn w:val="Normal"/>
   </w:style>
-  <w:style w:type="paragraph" w:styleId="Caption">
+  <w:style w:type="paragraph" w:styleId="Descripcin">
     <w:name w:val="caption"/>
     <w:basedOn w:val="Normal"/>
-    <w:link w:val="CaptionChar"/>
+    <w:link w:val="DescripcinCar"/>
     <w:pPr>
       <w:spacing w:after="120"/>
     </w:pPr>
@@ -3994,14 +4638,14 @@
   </w:style>
   <w:style w:type="paragraph" w:customStyle="1" w:styleId="TableCaption">
     <w:name w:val="Table Caption"/>
-    <w:basedOn w:val="Caption"/>
+    <w:basedOn w:val="Descripcin"/>
     <w:pPr>
       <w:keepNext/>
     </w:pPr>
   </w:style>
   <w:style w:type="paragraph" w:customStyle="1" w:styleId="ImageCaption">
     <w:name w:val="Image Caption"/>
-    <w:basedOn w:val="Caption"/>
+    <w:basedOn w:val="Descripcin"/>
   </w:style>
   <w:style w:type="paragraph" w:customStyle="1" w:styleId="Figure">
     <w:name w:val="Figure"/>
@@ -4014,14 +4658,14 @@
       <w:keepNext/>
     </w:pPr>
   </w:style>
-  <w:style w:type="character" w:customStyle="1" w:styleId="CaptionChar">
-    <w:name w:val="Caption Char"/>
-    <w:basedOn w:val="DefaultParagraphFont"/>
-    <w:link w:val="Caption"/>
+  <w:style w:type="character" w:customStyle="1" w:styleId="DescripcinCar">
+    <w:name w:val="Descripción Car"/>
+    <w:basedOn w:val="Fuentedeprrafopredeter"/>
+    <w:link w:val="Descripcin"/>
   </w:style>
   <w:style w:type="character" w:customStyle="1" w:styleId="VerbatimChar">
     <w:name w:val="Verbatim Char"/>
-    <w:basedOn w:val="CaptionChar"/>
+    <w:basedOn w:val="DescripcinCar"/>
     <w:link w:val="SourceCode"/>
     <w:rPr>
       <w:rFonts w:ascii="Consolas" w:hAnsi="Consolas"/>
@@ -4030,27 +4674,27 @@
   </w:style>
   <w:style w:type="character" w:customStyle="1" w:styleId="SectionNumber">
     <w:name w:val="Section Number"/>
-    <w:basedOn w:val="CaptionChar"/>
-  </w:style>
-  <w:style w:type="character" w:styleId="FootnoteReference">
+    <w:basedOn w:val="DescripcinCar"/>
+  </w:style>
+  <w:style w:type="character" w:styleId="Refdenotaalpie">
     <w:name w:val="footnote reference"/>
-    <w:basedOn w:val="CaptionChar"/>
+    <w:basedOn w:val="DescripcinCar"/>
     <w:rPr>
       <w:vertAlign w:val="superscript"/>
     </w:rPr>
   </w:style>
-  <w:style w:type="character" w:styleId="Hyperlink">
+  <w:style w:type="character" w:styleId="Hipervnculo">
     <w:name w:val="Hyperlink"/>
-    <w:basedOn w:val="CaptionChar"/>
+    <w:basedOn w:val="DescripcinCar"/>
     <w:uiPriority w:val="99"/>
     <w:rPr>
       <w:color w:val="156082" w:themeColor="accent1"/>
     </w:rPr>
   </w:style>
-  <w:style w:type="paragraph" w:styleId="TOCHeading">
+  <w:style w:type="paragraph" w:styleId="TtuloTDC">
     <w:name w:val="TOC Heading"/>
-    <w:basedOn w:val="Heading1"/>
-    <w:next w:val="BodyText"/>
+    <w:basedOn w:val="Ttulo1"/>
+    <w:next w:val="Textoindependiente"/>
     <w:uiPriority w:val="39"/>
     <w:unhideWhenUsed/>
     <w:qFormat/>
@@ -4065,7 +4709,7 @@
   </w:style>
   <w:style w:type="paragraph" w:customStyle="1" w:styleId="Centrado">
     <w:name w:val="Centrado"/>
-    <w:basedOn w:val="BodyText"/>
+    <w:basedOn w:val="Textoindependiente"/>
     <w:qFormat/>
     <w:pPr>
       <w:spacing w:before="100" w:after="100"/>
@@ -4074,7 +4718,7 @@
   </w:style>
   <w:style w:type="paragraph" w:customStyle="1" w:styleId="TituloCaratula">
     <w:name w:val="TituloCaratula"/>
-    <w:basedOn w:val="BodyText"/>
+    <w:basedOn w:val="Textoindependiente"/>
     <w:qFormat/>
     <w:pPr>
       <w:spacing w:before="240" w:after="240"/>
@@ -4086,7 +4730,7 @@
   </w:style>
   <w:style w:type="paragraph" w:customStyle="1" w:styleId="Caratula">
     <w:name w:val="Caratula"/>
-    <w:basedOn w:val="BodyText"/>
+    <w:basedOn w:val="Textoindependiente"/>
     <w:qFormat/>
     <w:pPr>
       <w:spacing w:after="80"/>
@@ -4144,7 +4788,7 @@
   </w:style>
   <w:style w:type="paragraph" w:customStyle="1" w:styleId="Instruccion">
     <w:name w:val="Instruccion"/>
-    <w:basedOn w:val="BodyText"/>
+    <w:basedOn w:val="Textoindependiente"/>
     <w:qFormat/>
     <w:pPr>
       <w:spacing w:after="100"/>
@@ -4187,32 +4831,32 @@
   </w:style>
   <w:style w:type="paragraph" w:customStyle="1" w:styleId="CaratulaCurso0">
     <w:name w:val="CaratulaCurso"/>
-    <w:basedOn w:val="BodyText"/>
+    <w:basedOn w:val="Textoindependiente"/>
     <w:qFormat/>
   </w:style>
   <w:style w:type="paragraph" w:customStyle="1" w:styleId="CaratulaEtiqueta0">
     <w:name w:val="CaratulaEtiqueta"/>
-    <w:basedOn w:val="BodyText"/>
+    <w:basedOn w:val="Textoindependiente"/>
     <w:qFormat/>
   </w:style>
   <w:style w:type="paragraph" w:customStyle="1" w:styleId="CaratulaInstitucion0">
     <w:name w:val="CaratulaInstitucion"/>
-    <w:basedOn w:val="BodyText"/>
+    <w:basedOn w:val="Textoindependiente"/>
     <w:qFormat/>
   </w:style>
   <w:style w:type="paragraph" w:customStyle="1" w:styleId="CaratulaLinea0">
     <w:name w:val="CaratulaLinea"/>
-    <w:basedOn w:val="BodyText"/>
+    <w:basedOn w:val="Textoindependiente"/>
     <w:qFormat/>
   </w:style>
   <w:style w:type="paragraph" w:customStyle="1" w:styleId="CaratulaPie0">
     <w:name w:val="CaratulaPie"/>
-    <w:basedOn w:val="BodyText"/>
+    <w:basedOn w:val="Textoindependiente"/>
     <w:qFormat/>
   </w:style>
   <w:style w:type="paragraph" w:customStyle="1" w:styleId="CaratulaTitulo0">
     <w:name w:val="CaratulaTitulo"/>
-    <w:basedOn w:val="BodyText"/>
+    <w:basedOn w:val="Textoindependiente"/>
     <w:qFormat/>
   </w:style>
   <w:style w:type="paragraph" w:customStyle="1" w:styleId="SourceCode">
@@ -4514,7 +5158,7 @@
       <w:sz w:val="22"/>
     </w:rPr>
   </w:style>
-  <w:style w:type="paragraph" w:styleId="TOC1">
+  <w:style w:type="paragraph" w:styleId="TDC1">
     <w:name w:val="toc 1"/>
     <w:basedOn w:val="Normal"/>
     <w:next w:val="Normal"/>
@@ -4525,7 +5169,7 @@
       <w:spacing w:after="100"/>
     </w:pPr>
   </w:style>
-  <w:style w:type="paragraph" w:styleId="TOC2">
+  <w:style w:type="paragraph" w:styleId="TDC2">
     <w:name w:val="toc 2"/>
     <w:basedOn w:val="Normal"/>
     <w:next w:val="Normal"/>
@@ -4536,6 +5180,28 @@
       <w:spacing w:after="100"/>
       <w:ind w:left="220"/>
     </w:pPr>
+  </w:style>
+  <w:style w:type="character" w:styleId="Textoennegrita">
+    <w:name w:val="Strong"/>
+    <w:basedOn w:val="Fuentedeprrafopredeter"/>
+    <w:uiPriority w:val="22"/>
+    <w:qFormat/>
+    <w:rsid w:val="00EA51AF"/>
+    <w:rPr>
+      <w:b/>
+      <w:bCs/>
+    </w:rPr>
+  </w:style>
+  <w:style w:type="character" w:styleId="nfasis">
+    <w:name w:val="Emphasis"/>
+    <w:basedOn w:val="Fuentedeprrafopredeter"/>
+    <w:uiPriority w:val="20"/>
+    <w:qFormat/>
+    <w:rsid w:val="00EA51AF"/>
+    <w:rPr>
+      <w:i/>
+      <w:iCs/>
+    </w:rPr>
   </w:style>
 </w:styles>
 </file>

</xml_diff>